<commit_message>
Phase 2 document and deck: audit corrections, comparison split by protocol
- Table 11.4 / 15.1 / Template 17.2: parameter counts from braindecode 1.8.1 at 875 and
  1,125 samples. EEGNet 3,188 / 3,700; 2,548 corresponds to a ~2.2 s window. The old
  4,096 (EEG-TCNet) and 553,654 (DeepConvNet) are replaced.
- New Table 15.2: CTNet paper's LOSO table as the cross-subject reference, method stated.
- New Table 15.3: within-subject figures with source and protocol; 71.50% removed.
- Deck: new slide 10 "Published results, split by protocol" (13 slides).
- HANDOFF.md: 68-70% LOSO claim and SATrans-Net 72.33% withdrawn, tables updated.
- Builders write output next to the script (__dirname), not /home/sandbox/review2.
</commit_message>
<xml_diff>
--- a/Neural Decoder using EEG & Motor Imagery/Phase2_Solution_Design.docx
+++ b/Neural Decoder using EEG & Motor Imagery/Phase2_Solution_Design.docx
@@ -15743,9 +15743,10 @@
         </w:tblBorders>
       </w:tblPr>
       <w:tblGrid>
-        <w:gridCol w:w="3600"/>
         <w:gridCol w:w="2900"/>
-        <w:gridCol w:w="3000"/>
+        <w:gridCol w:w="2000"/>
+        <w:gridCol w:w="2000"/>
+        <w:gridCol w:w="2600"/>
       </w:tblGrid>
       <w:tr>
         <w:trPr>
@@ -15754,7 +15755,7 @@
         </w:trPr>
         <w:tc>
           <w:tcPr>
-            <w:tcW w:type="dxa" w:w="3600"/>
+            <w:tcW w:type="dxa" w:w="2900"/>
             <w:shd w:fill="1B3A6B" w:color="auto" w:val="clear"/>
             <w:tcMar>
               <w:top w:type="dxa" w:w="72"/>
@@ -15782,7 +15783,7 @@
         </w:tc>
         <w:tc>
           <w:tcPr>
-            <w:tcW w:type="dxa" w:w="2900"/>
+            <w:tcW w:type="dxa" w:w="2000"/>
             <w:shd w:fill="1B3A6B" w:color="auto" w:val="clear"/>
             <w:tcMar>
               <w:top w:type="dxa" w:w="72"/>
@@ -15804,13 +15805,13 @@
                 <w:sz w:val="18"/>
                 <w:szCs w:val="18"/>
               </w:rPr>
-              <w:t xml:space="preserve">Parameters</w:t>
-            </w:r>
-          </w:p>
-        </w:tc>
-        <w:tc>
-          <w:tcPr>
-            <w:tcW w:type="dxa" w:w="3000"/>
+              <w:t xml:space="preserve">At 875 samples</w:t>
+            </w:r>
+          </w:p>
+        </w:tc>
+        <w:tc>
+          <w:tcPr>
+            <w:tcW w:type="dxa" w:w="2000"/>
             <w:shd w:fill="1B3A6B" w:color="auto" w:val="clear"/>
             <w:tcMar>
               <w:top w:type="dxa" w:w="72"/>
@@ -15832,6 +15833,34 @@
                 <w:sz w:val="18"/>
                 <w:szCs w:val="18"/>
               </w:rPr>
+              <w:t xml:space="preserve">At 1,125 samples</w:t>
+            </w:r>
+          </w:p>
+        </w:tc>
+        <w:tc>
+          <w:tcPr>
+            <w:tcW w:type="dxa" w:w="2600"/>
+            <w:shd w:fill="1B3A6B" w:color="auto" w:val="clear"/>
+            <w:tcMar>
+              <w:top w:type="dxa" w:w="72"/>
+              <w:left w:type="dxa" w:w="95"/>
+              <w:bottom w:type="dxa" w:w="72"/>
+              <w:right w:type="dxa" w:w="95"/>
+            </w:tcMar>
+          </w:tcPr>
+          <w:p>
+            <w:pPr>
+              <w:spacing w:after="0" w:line="248"/>
+              <w:jc w:val="center"/>
+            </w:pPr>
+            <w:r>
+              <w:rPr>
+                <w:b/>
+                <w:bCs/>
+                <w:color w:val="FFFFFF"/>
+                <w:sz w:val="18"/>
+                <w:szCs w:val="18"/>
+              </w:rPr>
               <w:t xml:space="preserve">Relative to the proposed model</w:t>
             </w:r>
           </w:p>
@@ -15843,7 +15872,7 @@
         </w:trPr>
         <w:tc>
           <w:tcPr>
-            <w:tcW w:type="dxa" w:w="3600"/>
+            <w:tcW w:type="dxa" w:w="2900"/>
             <w:tcMar>
               <w:top w:type="dxa" w:w="72"/>
               <w:left w:type="dxa" w:w="95"/>
@@ -15869,7 +15898,7 @@
         </w:tc>
         <w:tc>
           <w:tcPr>
-            <w:tcW w:type="dxa" w:w="2900"/>
+            <w:tcW w:type="dxa" w:w="2000"/>
             <w:tcMar>
               <w:top w:type="dxa" w:w="72"/>
               <w:left w:type="dxa" w:w="95"/>
@@ -15889,13 +15918,13 @@
                 <w:sz w:val="18"/>
                 <w:szCs w:val="18"/>
               </w:rPr>
-              <w:t xml:space="preserve">2,548</w:t>
-            </w:r>
-          </w:p>
-        </w:tc>
-        <w:tc>
-          <w:tcPr>
-            <w:tcW w:type="dxa" w:w="3000"/>
+              <w:t xml:space="preserve">3,188</w:t>
+            </w:r>
+          </w:p>
+        </w:tc>
+        <w:tc>
+          <w:tcPr>
+            <w:tcW w:type="dxa" w:w="2000"/>
             <w:tcMar>
               <w:top w:type="dxa" w:w="72"/>
               <w:left w:type="dxa" w:w="95"/>
@@ -15915,7 +15944,33 @@
                 <w:sz w:val="18"/>
                 <w:szCs w:val="18"/>
               </w:rPr>
-              <w:t xml:space="preserve">0.12 ×</w:t>
+              <w:t xml:space="preserve">3,700</w:t>
+            </w:r>
+          </w:p>
+        </w:tc>
+        <w:tc>
+          <w:tcPr>
+            <w:tcW w:type="dxa" w:w="2600"/>
+            <w:tcMar>
+              <w:top w:type="dxa" w:w="72"/>
+              <w:left w:type="dxa" w:w="95"/>
+              <w:bottom w:type="dxa" w:w="72"/>
+              <w:right w:type="dxa" w:w="95"/>
+            </w:tcMar>
+          </w:tcPr>
+          <w:p>
+            <w:pPr>
+              <w:spacing w:after="0" w:line="248"/>
+              <w:jc w:val="center"/>
+            </w:pPr>
+            <w:r>
+              <w:rPr>
+                <w:b w:val="false"/>
+                <w:bCs w:val="false"/>
+                <w:sz w:val="18"/>
+                <w:szCs w:val="18"/>
+              </w:rPr>
+              <w:t xml:space="preserve">0.15 ×</w:t>
             </w:r>
           </w:p>
         </w:tc>
@@ -15926,7 +15981,7 @@
         </w:trPr>
         <w:tc>
           <w:tcPr>
-            <w:tcW w:type="dxa" w:w="3600"/>
+            <w:tcW w:type="dxa" w:w="2900"/>
             <w:shd w:fill="EFF3F9" w:color="auto" w:val="clear"/>
             <w:tcMar>
               <w:top w:type="dxa" w:w="72"/>
@@ -15953,7 +16008,7 @@
         </w:tc>
         <w:tc>
           <w:tcPr>
-            <w:tcW w:type="dxa" w:w="2900"/>
+            <w:tcW w:type="dxa" w:w="2000"/>
             <w:shd w:fill="EFF3F9" w:color="auto" w:val="clear"/>
             <w:tcMar>
               <w:top w:type="dxa" w:w="72"/>
@@ -15974,13 +16029,40 @@
                 <w:sz w:val="18"/>
                 <w:szCs w:val="18"/>
               </w:rPr>
-              <w:t xml:space="preserve">4,096</w:t>
-            </w:r>
-          </w:p>
-        </w:tc>
-        <w:tc>
-          <w:tcPr>
-            <w:tcW w:type="dxa" w:w="3000"/>
+              <w:t xml:space="preserve">4,304</w:t>
+            </w:r>
+          </w:p>
+        </w:tc>
+        <w:tc>
+          <w:tcPr>
+            <w:tcW w:type="dxa" w:w="2000"/>
+            <w:shd w:fill="EFF3F9" w:color="auto" w:val="clear"/>
+            <w:tcMar>
+              <w:top w:type="dxa" w:w="72"/>
+              <w:left w:type="dxa" w:w="95"/>
+              <w:bottom w:type="dxa" w:w="72"/>
+              <w:right w:type="dxa" w:w="95"/>
+            </w:tcMar>
+          </w:tcPr>
+          <w:p>
+            <w:pPr>
+              <w:spacing w:after="0" w:line="248"/>
+              <w:jc w:val="center"/>
+            </w:pPr>
+            <w:r>
+              <w:rPr>
+                <w:b w:val="false"/>
+                <w:bCs w:val="false"/>
+                <w:sz w:val="18"/>
+                <w:szCs w:val="18"/>
+              </w:rPr>
+              <w:t xml:space="preserve">4,304</w:t>
+            </w:r>
+          </w:p>
+        </w:tc>
+        <w:tc>
+          <w:tcPr>
+            <w:tcW w:type="dxa" w:w="2600"/>
             <w:shd w:fill="EFF3F9" w:color="auto" w:val="clear"/>
             <w:tcMar>
               <w:top w:type="dxa" w:w="72"/>
@@ -16012,7 +16094,7 @@
         </w:trPr>
         <w:tc>
           <w:tcPr>
-            <w:tcW w:type="dxa" w:w="3600"/>
+            <w:tcW w:type="dxa" w:w="2900"/>
             <w:shd w:fill="F3F0FA" w:color="auto" w:val="clear"/>
             <w:tcMar>
               <w:top w:type="dxa" w:w="72"/>
@@ -16039,7 +16121,7 @@
         </w:tc>
         <w:tc>
           <w:tcPr>
-            <w:tcW w:type="dxa" w:w="2900"/>
+            <w:tcW w:type="dxa" w:w="2000"/>
             <w:shd w:fill="F3F0FA" w:color="auto" w:val="clear"/>
             <w:tcMar>
               <w:top w:type="dxa" w:w="72"/>
@@ -16066,7 +16148,34 @@
         </w:tc>
         <w:tc>
           <w:tcPr>
-            <w:tcW w:type="dxa" w:w="3000"/>
+            <w:tcW w:type="dxa" w:w="2000"/>
+            <w:shd w:fill="F3F0FA" w:color="auto" w:val="clear"/>
+            <w:tcMar>
+              <w:top w:type="dxa" w:w="72"/>
+              <w:left w:type="dxa" w:w="95"/>
+              <w:bottom w:type="dxa" w:w="72"/>
+              <w:right w:type="dxa" w:w="95"/>
+            </w:tcMar>
+          </w:tcPr>
+          <w:p>
+            <w:pPr>
+              <w:spacing w:after="0" w:line="248"/>
+              <w:jc w:val="center"/>
+            </w:pPr>
+            <w:r>
+              <w:rPr>
+                <w:b w:val="false"/>
+                <w:bCs w:val="false"/>
+                <w:sz w:val="18"/>
+                <w:szCs w:val="18"/>
+              </w:rPr>
+              <w:t xml:space="preserve">—</w:t>
+            </w:r>
+          </w:p>
+        </w:tc>
+        <w:tc>
+          <w:tcPr>
+            <w:tcW w:type="dxa" w:w="2600"/>
             <w:shd w:fill="F3F0FA" w:color="auto" w:val="clear"/>
             <w:tcMar>
               <w:top w:type="dxa" w:w="72"/>
@@ -16098,7 +16207,7 @@
         </w:trPr>
         <w:tc>
           <w:tcPr>
-            <w:tcW w:type="dxa" w:w="3600"/>
+            <w:tcW w:type="dxa" w:w="2900"/>
             <w:shd w:fill="EFF3F9" w:color="auto" w:val="clear"/>
             <w:tcMar>
               <w:top w:type="dxa" w:w="72"/>
@@ -16125,7 +16234,7 @@
         </w:tc>
         <w:tc>
           <w:tcPr>
-            <w:tcW w:type="dxa" w:w="2900"/>
+            <w:tcW w:type="dxa" w:w="2000"/>
             <w:shd w:fill="EFF3F9" w:color="auto" w:val="clear"/>
             <w:tcMar>
               <w:top w:type="dxa" w:w="72"/>
@@ -16146,13 +16255,13 @@
                 <w:sz w:val="18"/>
                 <w:szCs w:val="18"/>
               </w:rPr>
-              <w:t xml:space="preserve">47,364</w:t>
-            </w:r>
-          </w:p>
-        </w:tc>
-        <w:tc>
-          <w:tcPr>
-            <w:tcW w:type="dxa" w:w="3000"/>
+              <w:t xml:space="preserve">44,644</w:t>
+            </w:r>
+          </w:p>
+        </w:tc>
+        <w:tc>
+          <w:tcPr>
+            <w:tcW w:type="dxa" w:w="2000"/>
             <w:shd w:fill="EFF3F9" w:color="auto" w:val="clear"/>
             <w:tcMar>
               <w:top w:type="dxa" w:w="72"/>
@@ -16173,7 +16282,34 @@
                 <w:sz w:val="18"/>
                 <w:szCs w:val="18"/>
               </w:rPr>
-              <w:t xml:space="preserve">2.26 ×</w:t>
+              <w:t xml:space="preserve">47,364</w:t>
+            </w:r>
+          </w:p>
+        </w:tc>
+        <w:tc>
+          <w:tcPr>
+            <w:tcW w:type="dxa" w:w="2600"/>
+            <w:shd w:fill="EFF3F9" w:color="auto" w:val="clear"/>
+            <w:tcMar>
+              <w:top w:type="dxa" w:w="72"/>
+              <w:left w:type="dxa" w:w="95"/>
+              <w:bottom w:type="dxa" w:w="72"/>
+              <w:right w:type="dxa" w:w="95"/>
+            </w:tcMar>
+          </w:tcPr>
+          <w:p>
+            <w:pPr>
+              <w:spacing w:after="0" w:line="248"/>
+              <w:jc w:val="center"/>
+            </w:pPr>
+            <w:r>
+              <w:rPr>
+                <w:b w:val="false"/>
+                <w:bCs w:val="false"/>
+                <w:sz w:val="18"/>
+                <w:szCs w:val="18"/>
+              </w:rPr>
+              <w:t xml:space="preserve">2.13 ×</w:t>
             </w:r>
           </w:p>
         </w:tc>
@@ -16184,7 +16320,7 @@
         </w:trPr>
         <w:tc>
           <w:tcPr>
-            <w:tcW w:type="dxa" w:w="3600"/>
+            <w:tcW w:type="dxa" w:w="2900"/>
             <w:tcMar>
               <w:top w:type="dxa" w:w="72"/>
               <w:left w:type="dxa" w:w="95"/>
@@ -16210,7 +16346,7 @@
         </w:tc>
         <w:tc>
           <w:tcPr>
-            <w:tcW w:type="dxa" w:w="2900"/>
+            <w:tcW w:type="dxa" w:w="2000"/>
             <w:tcMar>
               <w:top w:type="dxa" w:w="72"/>
               <w:left w:type="dxa" w:w="95"/>
@@ -16236,7 +16372,33 @@
         </w:tc>
         <w:tc>
           <w:tcPr>
-            <w:tcW w:type="dxa" w:w="3000"/>
+            <w:tcW w:type="dxa" w:w="2000"/>
+            <w:tcMar>
+              <w:top w:type="dxa" w:w="72"/>
+              <w:left w:type="dxa" w:w="95"/>
+              <w:bottom w:type="dxa" w:w="72"/>
+              <w:right w:type="dxa" w:w="95"/>
+            </w:tcMar>
+          </w:tcPr>
+          <w:p>
+            <w:pPr>
+              <w:spacing w:after="0" w:line="248"/>
+              <w:jc w:val="center"/>
+            </w:pPr>
+            <w:r>
+              <w:rPr>
+                <w:b w:val="false"/>
+                <w:bCs w:val="false"/>
+                <w:sz w:val="18"/>
+                <w:szCs w:val="18"/>
+              </w:rPr>
+              <w:t xml:space="preserve">113,732</w:t>
+            </w:r>
+          </w:p>
+        </w:tc>
+        <w:tc>
+          <w:tcPr>
+            <w:tcW w:type="dxa" w:w="2600"/>
             <w:tcMar>
               <w:top w:type="dxa" w:w="72"/>
               <w:left w:type="dxa" w:w="95"/>
@@ -16267,7 +16429,7 @@
         </w:trPr>
         <w:tc>
           <w:tcPr>
-            <w:tcW w:type="dxa" w:w="3600"/>
+            <w:tcW w:type="dxa" w:w="2900"/>
             <w:shd w:fill="EFF3F9" w:color="auto" w:val="clear"/>
             <w:tcMar>
               <w:top w:type="dxa" w:w="72"/>
@@ -16288,13 +16450,13 @@
                 <w:sz w:val="18"/>
                 <w:szCs w:val="18"/>
               </w:rPr>
-              <w:t xml:space="preserve">DeepConvNet</w:t>
-            </w:r>
-          </w:p>
-        </w:tc>
-        <w:tc>
-          <w:tcPr>
-            <w:tcW w:type="dxa" w:w="2900"/>
+              <w:t xml:space="preserve">CTNet</w:t>
+            </w:r>
+          </w:p>
+        </w:tc>
+        <w:tc>
+          <w:tcPr>
+            <w:tcW w:type="dxa" w:w="2000"/>
             <w:shd w:fill="EFF3F9" w:color="auto" w:val="clear"/>
             <w:tcMar>
               <w:top w:type="dxa" w:w="72"/>
@@ -16315,13 +16477,13 @@
                 <w:sz w:val="18"/>
                 <w:szCs w:val="18"/>
               </w:rPr>
-              <w:t xml:space="preserve">553,654</w:t>
-            </w:r>
-          </w:p>
-        </w:tc>
-        <w:tc>
-          <w:tcPr>
-            <w:tcW w:type="dxa" w:w="3000"/>
+              <w:t xml:space="preserve">152,364</w:t>
+            </w:r>
+          </w:p>
+        </w:tc>
+        <w:tc>
+          <w:tcPr>
+            <w:tcW w:type="dxa" w:w="2000"/>
             <w:shd w:fill="EFF3F9" w:color="auto" w:val="clear"/>
             <w:tcMar>
               <w:top w:type="dxa" w:w="72"/>
@@ -16342,7 +16504,256 @@
                 <w:sz w:val="18"/>
                 <w:szCs w:val="18"/>
               </w:rPr>
-              <w:t xml:space="preserve">26.37 ×</w:t>
+              <w:t xml:space="preserve">153,004</w:t>
+            </w:r>
+          </w:p>
+        </w:tc>
+        <w:tc>
+          <w:tcPr>
+            <w:tcW w:type="dxa" w:w="2600"/>
+            <w:shd w:fill="EFF3F9" w:color="auto" w:val="clear"/>
+            <w:tcMar>
+              <w:top w:type="dxa" w:w="72"/>
+              <w:left w:type="dxa" w:w="95"/>
+              <w:bottom w:type="dxa" w:w="72"/>
+              <w:right w:type="dxa" w:w="95"/>
+            </w:tcMar>
+          </w:tcPr>
+          <w:p>
+            <w:pPr>
+              <w:spacing w:after="0" w:line="248"/>
+              <w:jc w:val="center"/>
+            </w:pPr>
+            <w:r>
+              <w:rPr>
+                <w:b w:val="false"/>
+                <w:bCs w:val="false"/>
+                <w:sz w:val="18"/>
+                <w:szCs w:val="18"/>
+              </w:rPr>
+              <w:t xml:space="preserve">7.26 ×</w:t>
+            </w:r>
+          </w:p>
+        </w:tc>
+      </w:tr>
+      <w:tr>
+        <w:trPr>
+          <w:cantSplit/>
+        </w:trPr>
+        <w:tc>
+          <w:tcPr>
+            <w:tcW w:type="dxa" w:w="2900"/>
+            <w:tcMar>
+              <w:top w:type="dxa" w:w="72"/>
+              <w:left w:type="dxa" w:w="95"/>
+              <w:bottom w:type="dxa" w:w="72"/>
+              <w:right w:type="dxa" w:w="95"/>
+            </w:tcMar>
+          </w:tcPr>
+          <w:p>
+            <w:pPr>
+              <w:spacing w:after="0" w:line="248"/>
+              <w:jc w:val="left"/>
+            </w:pPr>
+            <w:r>
+              <w:rPr>
+                <w:b/>
+                <w:bCs/>
+                <w:sz w:val="18"/>
+                <w:szCs w:val="18"/>
+              </w:rPr>
+              <w:t xml:space="preserve">DeepConvNet</w:t>
+            </w:r>
+          </w:p>
+        </w:tc>
+        <w:tc>
+          <w:tcPr>
+            <w:tcW w:type="dxa" w:w="2000"/>
+            <w:tcMar>
+              <w:top w:type="dxa" w:w="72"/>
+              <w:left w:type="dxa" w:w="95"/>
+              <w:bottom w:type="dxa" w:w="72"/>
+              <w:right w:type="dxa" w:w="95"/>
+            </w:tcMar>
+          </w:tcPr>
+          <w:p>
+            <w:pPr>
+              <w:spacing w:after="0" w:line="248"/>
+              <w:jc w:val="center"/>
+            </w:pPr>
+            <w:r>
+              <w:rPr>
+                <w:b w:val="false"/>
+                <w:bCs w:val="false"/>
+                <w:sz w:val="18"/>
+                <w:szCs w:val="18"/>
+              </w:rPr>
+              <w:t xml:space="preserve">282,079</w:t>
+            </w:r>
+          </w:p>
+        </w:tc>
+        <w:tc>
+          <w:tcPr>
+            <w:tcW w:type="dxa" w:w="2000"/>
+            <w:tcMar>
+              <w:top w:type="dxa" w:w="72"/>
+              <w:left w:type="dxa" w:w="95"/>
+              <w:bottom w:type="dxa" w:w="72"/>
+              <w:right w:type="dxa" w:w="95"/>
+            </w:tcMar>
+          </w:tcPr>
+          <w:p>
+            <w:pPr>
+              <w:spacing w:after="0" w:line="248"/>
+              <w:jc w:val="center"/>
+            </w:pPr>
+            <w:r>
+              <w:rPr>
+                <w:b w:val="false"/>
+                <w:bCs w:val="false"/>
+                <w:sz w:val="18"/>
+                <w:szCs w:val="18"/>
+              </w:rPr>
+              <w:t xml:space="preserve">284,479</w:t>
+            </w:r>
+          </w:p>
+        </w:tc>
+        <w:tc>
+          <w:tcPr>
+            <w:tcW w:type="dxa" w:w="2600"/>
+            <w:tcMar>
+              <w:top w:type="dxa" w:w="72"/>
+              <w:left w:type="dxa" w:w="95"/>
+              <w:bottom w:type="dxa" w:w="72"/>
+              <w:right w:type="dxa" w:w="95"/>
+            </w:tcMar>
+          </w:tcPr>
+          <w:p>
+            <w:pPr>
+              <w:spacing w:after="0" w:line="248"/>
+              <w:jc w:val="center"/>
+            </w:pPr>
+            <w:r>
+              <w:rPr>
+                <w:b w:val="false"/>
+                <w:bCs w:val="false"/>
+                <w:sz w:val="18"/>
+                <w:szCs w:val="18"/>
+              </w:rPr>
+              <w:t xml:space="preserve">13.43 ×</w:t>
+            </w:r>
+          </w:p>
+        </w:tc>
+      </w:tr>
+      <w:tr>
+        <w:trPr>
+          <w:cantSplit/>
+        </w:trPr>
+        <w:tc>
+          <w:tcPr>
+            <w:tcW w:type="dxa" w:w="2900"/>
+            <w:shd w:fill="EFF3F9" w:color="auto" w:val="clear"/>
+            <w:tcMar>
+              <w:top w:type="dxa" w:w="72"/>
+              <w:left w:type="dxa" w:w="95"/>
+              <w:bottom w:type="dxa" w:w="72"/>
+              <w:right w:type="dxa" w:w="95"/>
+            </w:tcMar>
+          </w:tcPr>
+          <w:p>
+            <w:pPr>
+              <w:spacing w:after="0" w:line="248"/>
+              <w:jc w:val="left"/>
+            </w:pPr>
+            <w:r>
+              <w:rPr>
+                <w:b/>
+                <w:bCs/>
+                <w:sz w:val="18"/>
+                <w:szCs w:val="18"/>
+              </w:rPr>
+              <w:t xml:space="preserve">EEG Conformer</w:t>
+            </w:r>
+          </w:p>
+        </w:tc>
+        <w:tc>
+          <w:tcPr>
+            <w:tcW w:type="dxa" w:w="2000"/>
+            <w:shd w:fill="EFF3F9" w:color="auto" w:val="clear"/>
+            <w:tcMar>
+              <w:top w:type="dxa" w:w="72"/>
+              <w:left w:type="dxa" w:w="95"/>
+              <w:bottom w:type="dxa" w:w="72"/>
+              <w:right w:type="dxa" w:w="95"/>
+            </w:tcMar>
+          </w:tcPr>
+          <w:p>
+            <w:pPr>
+              <w:spacing w:after="0" w:line="248"/>
+              <w:jc w:val="center"/>
+            </w:pPr>
+            <w:r>
+              <w:rPr>
+                <w:b w:val="false"/>
+                <w:bCs w:val="false"/>
+                <w:sz w:val="18"/>
+                <w:szCs w:val="18"/>
+              </w:rPr>
+              <w:t xml:space="preserve">697,412</w:t>
+            </w:r>
+          </w:p>
+        </w:tc>
+        <w:tc>
+          <w:tcPr>
+            <w:tcW w:type="dxa" w:w="2000"/>
+            <w:shd w:fill="EFF3F9" w:color="auto" w:val="clear"/>
+            <w:tcMar>
+              <w:top w:type="dxa" w:w="72"/>
+              <w:left w:type="dxa" w:w="95"/>
+              <w:bottom w:type="dxa" w:w="72"/>
+              <w:right w:type="dxa" w:w="95"/>
+            </w:tcMar>
+          </w:tcPr>
+          <w:p>
+            <w:pPr>
+              <w:spacing w:after="0" w:line="248"/>
+              <w:jc w:val="center"/>
+            </w:pPr>
+            <w:r>
+              <w:rPr>
+                <w:b w:val="false"/>
+                <w:bCs w:val="false"/>
+                <w:sz w:val="18"/>
+                <w:szCs w:val="18"/>
+              </w:rPr>
+              <w:t xml:space="preserve">871,492</w:t>
+            </w:r>
+          </w:p>
+        </w:tc>
+        <w:tc>
+          <w:tcPr>
+            <w:tcW w:type="dxa" w:w="2600"/>
+            <w:shd w:fill="EFF3F9" w:color="auto" w:val="clear"/>
+            <w:tcMar>
+              <w:top w:type="dxa" w:w="72"/>
+              <w:left w:type="dxa" w:w="95"/>
+              <w:bottom w:type="dxa" w:w="72"/>
+              <w:right w:type="dxa" w:w="95"/>
+            </w:tcMar>
+          </w:tcPr>
+          <w:p>
+            <w:pPr>
+              <w:spacing w:after="0" w:line="248"/>
+              <w:jc w:val="center"/>
+            </w:pPr>
+            <w:r>
+              <w:rPr>
+                <w:b w:val="false"/>
+                <w:bCs w:val="false"/>
+                <w:sz w:val="18"/>
+                <w:szCs w:val="18"/>
+              </w:rPr>
+              <w:t xml:space="preserve">33.22 ×</w:t>
             </w:r>
           </w:p>
         </w:tc>
@@ -16360,7 +16771,7 @@
           <w:sz w:val="17"/>
           <w:szCs w:val="17"/>
         </w:rPr>
-        <w:t xml:space="preserve">Table 11.4 — Parameter count in context. Counts for the published models are from the ATCNet reference implementation. The proposed model is roughly one fifth the size of ATCNet and comfortably inside the 50,000 budget, leaving room for adjustment during tuning.</w:t>
+        <w:t xml:space="preserve">Table 11.4 — Parameter count in context, for 22 channels and four classes, computed with the braindecode 1.8.1 reference implementations at this project's 875-sample input and at the 1,125-sample input used by the ATCNet reference implementation. The ratio column compares like with like, at 875 samples. For models whose classifier sizes itself from the input, the count depends on window length: EEGNet has 3,188 parameters at 875 samples and 3,700 at 1,125, and the figure of 2,548 often quoted for EEGNet corresponds to a window of about 2.2 s. An earlier version of this table gave 4,096 for EEG-TCNet and 553,654 for DeepConvNet; neither matches the reference implementation at any input length, and both have been replaced. The proposed model is roughly one fifth the size of ATCNet and comfortably inside the 50,000 budget.</w:t>
       </w:r>
     </w:p>
     <w:p>
@@ -20711,11 +21122,11 @@
         </w:tblBorders>
       </w:tblPr>
       <w:tblGrid>
-        <w:gridCol w:w="2200"/>
-        <w:gridCol w:w="2100"/>
-        <w:gridCol w:w="2500"/>
-        <w:gridCol w:w="1400"/>
-        <w:gridCol w:w="1300"/>
+        <w:gridCol w:w="1900"/>
+        <w:gridCol w:w="1900"/>
+        <w:gridCol w:w="2600"/>
+        <w:gridCol w:w="1550"/>
+        <w:gridCol w:w="1550"/>
       </w:tblGrid>
       <w:tr>
         <w:trPr>
@@ -20724,7 +21135,7 @@
         </w:trPr>
         <w:tc>
           <w:tcPr>
-            <w:tcW w:type="dxa" w:w="2200"/>
+            <w:tcW w:type="dxa" w:w="1900"/>
             <w:shd w:fill="1B3A6B" w:color="auto" w:val="clear"/>
             <w:tcMar>
               <w:top w:type="dxa" w:w="72"/>
@@ -20752,7 +21163,7 @@
         </w:tc>
         <w:tc>
           <w:tcPr>
-            <w:tcW w:type="dxa" w:w="2100"/>
+            <w:tcW w:type="dxa" w:w="1900"/>
             <w:shd w:fill="1B3A6B" w:color="auto" w:val="clear"/>
             <w:tcMar>
               <w:top w:type="dxa" w:w="72"/>
@@ -20780,7 +21191,7 @@
         </w:tc>
         <w:tc>
           <w:tcPr>
-            <w:tcW w:type="dxa" w:w="2500"/>
+            <w:tcW w:type="dxa" w:w="2600"/>
             <w:shd w:fill="1B3A6B" w:color="auto" w:val="clear"/>
             <w:tcMar>
               <w:top w:type="dxa" w:w="72"/>
@@ -20808,7 +21219,7 @@
         </w:tc>
         <w:tc>
           <w:tcPr>
-            <w:tcW w:type="dxa" w:w="1400"/>
+            <w:tcW w:type="dxa" w:w="1550"/>
             <w:shd w:fill="1B3A6B" w:color="auto" w:val="clear"/>
             <w:tcMar>
               <w:top w:type="dxa" w:w="72"/>
@@ -20830,13 +21241,13 @@
                 <w:sz w:val="18"/>
                 <w:szCs w:val="18"/>
               </w:rPr>
-              <w:t xml:space="preserve">Parameters</w:t>
-            </w:r>
-          </w:p>
-        </w:tc>
-        <w:tc>
-          <w:tcPr>
-            <w:tcW w:type="dxa" w:w="1300"/>
+              <w:t xml:space="preserve">Parameters, 875 samples</w:t>
+            </w:r>
+          </w:p>
+        </w:tc>
+        <w:tc>
+          <w:tcPr>
+            <w:tcW w:type="dxa" w:w="1550"/>
             <w:shd w:fill="1B3A6B" w:color="auto" w:val="clear"/>
             <w:tcMar>
               <w:top w:type="dxa" w:w="72"/>
@@ -20858,7 +21269,7 @@
                 <w:sz w:val="18"/>
                 <w:szCs w:val="18"/>
               </w:rPr>
-              <w:t xml:space="preserve">Reported IV-2a</w:t>
+              <w:t xml:space="preserve">Parameters, 1,125 samples</w:t>
             </w:r>
           </w:p>
         </w:tc>
@@ -20869,7 +21280,7 @@
         </w:trPr>
         <w:tc>
           <w:tcPr>
-            <w:tcW w:type="dxa" w:w="2200"/>
+            <w:tcW w:type="dxa" w:w="1900"/>
             <w:tcMar>
               <w:top w:type="dxa" w:w="72"/>
               <w:left w:type="dxa" w:w="95"/>
@@ -20895,7 +21306,7 @@
         </w:tc>
         <w:tc>
           <w:tcPr>
-            <w:tcW w:type="dxa" w:w="2100"/>
+            <w:tcW w:type="dxa" w:w="1900"/>
             <w:tcMar>
               <w:top w:type="dxa" w:w="72"/>
               <w:left w:type="dxa" w:w="95"/>
@@ -20921,7 +21332,7 @@
         </w:tc>
         <w:tc>
           <w:tcPr>
-            <w:tcW w:type="dxa" w:w="2500"/>
+            <w:tcW w:type="dxa" w:w="2600"/>
             <w:tcMar>
               <w:top w:type="dxa" w:w="72"/>
               <w:left w:type="dxa" w:w="95"/>
@@ -20947,7 +21358,7 @@
         </w:tc>
         <w:tc>
           <w:tcPr>
-            <w:tcW w:type="dxa" w:w="1400"/>
+            <w:tcW w:type="dxa" w:w="1550"/>
             <w:tcMar>
               <w:top w:type="dxa" w:w="72"/>
               <w:left w:type="dxa" w:w="95"/>
@@ -20967,13 +21378,13 @@
                 <w:sz w:val="17"/>
                 <w:szCs w:val="17"/>
               </w:rPr>
-              <w:t xml:space="preserve">2,548</w:t>
-            </w:r>
-          </w:p>
-        </w:tc>
-        <w:tc>
-          <w:tcPr>
-            <w:tcW w:type="dxa" w:w="1300"/>
+              <w:t xml:space="preserve">3,188</w:t>
+            </w:r>
+          </w:p>
+        </w:tc>
+        <w:tc>
+          <w:tcPr>
+            <w:tcW w:type="dxa" w:w="1550"/>
             <w:tcMar>
               <w:top w:type="dxa" w:w="72"/>
               <w:left w:type="dxa" w:w="95"/>
@@ -20993,7 +21404,7 @@
                 <w:sz w:val="17"/>
                 <w:szCs w:val="17"/>
               </w:rPr>
-              <w:t xml:space="preserve">68.67% / 71.50%</w:t>
+              <w:t xml:space="preserve">3,700</w:t>
             </w:r>
           </w:p>
         </w:tc>
@@ -21004,7 +21415,7 @@
         </w:trPr>
         <w:tc>
           <w:tcPr>
-            <w:tcW w:type="dxa" w:w="2200"/>
+            <w:tcW w:type="dxa" w:w="1900"/>
             <w:shd w:fill="EFF3F9" w:color="auto" w:val="clear"/>
             <w:tcMar>
               <w:top w:type="dxa" w:w="72"/>
@@ -21031,7 +21442,7 @@
         </w:tc>
         <w:tc>
           <w:tcPr>
-            <w:tcW w:type="dxa" w:w="2100"/>
+            <w:tcW w:type="dxa" w:w="1900"/>
             <w:shd w:fill="EFF3F9" w:color="auto" w:val="clear"/>
             <w:tcMar>
               <w:top w:type="dxa" w:w="72"/>
@@ -21058,7 +21469,7 @@
         </w:tc>
         <w:tc>
           <w:tcPr>
-            <w:tcW w:type="dxa" w:w="2500"/>
+            <w:tcW w:type="dxa" w:w="2600"/>
             <w:shd w:fill="EFF3F9" w:color="auto" w:val="clear"/>
             <w:tcMar>
               <w:top w:type="dxa" w:w="72"/>
@@ -21085,7 +21496,7 @@
         </w:tc>
         <w:tc>
           <w:tcPr>
-            <w:tcW w:type="dxa" w:w="1400"/>
+            <w:tcW w:type="dxa" w:w="1550"/>
             <w:shd w:fill="EFF3F9" w:color="auto" w:val="clear"/>
             <w:tcMar>
               <w:top w:type="dxa" w:w="72"/>
@@ -21112,7 +21523,7 @@
         </w:tc>
         <w:tc>
           <w:tcPr>
-            <w:tcW w:type="dxa" w:w="1300"/>
+            <w:tcW w:type="dxa" w:w="1550"/>
             <w:shd w:fill="EFF3F9" w:color="auto" w:val="clear"/>
             <w:tcMar>
               <w:top w:type="dxa" w:w="72"/>
@@ -21133,7 +21544,7 @@
                 <w:sz w:val="17"/>
                 <w:szCs w:val="17"/>
               </w:rPr>
-              <w:t xml:space="preserve">81.10%</w:t>
+              <w:t xml:space="preserve">113,732</w:t>
             </w:r>
           </w:p>
         </w:tc>
@@ -21144,7 +21555,7 @@
         </w:trPr>
         <w:tc>
           <w:tcPr>
-            <w:tcW w:type="dxa" w:w="2200"/>
+            <w:tcW w:type="dxa" w:w="1900"/>
             <w:tcMar>
               <w:top w:type="dxa" w:w="72"/>
               <w:left w:type="dxa" w:w="95"/>
@@ -21170,7 +21581,7 @@
         </w:tc>
         <w:tc>
           <w:tcPr>
-            <w:tcW w:type="dxa" w:w="2100"/>
+            <w:tcW w:type="dxa" w:w="1900"/>
             <w:tcMar>
               <w:top w:type="dxa" w:w="72"/>
               <w:left w:type="dxa" w:w="95"/>
@@ -21196,7 +21607,7 @@
         </w:tc>
         <w:tc>
           <w:tcPr>
-            <w:tcW w:type="dxa" w:w="2500"/>
+            <w:tcW w:type="dxa" w:w="2600"/>
             <w:tcMar>
               <w:top w:type="dxa" w:w="72"/>
               <w:left w:type="dxa" w:w="95"/>
@@ -21222,7 +21633,7 @@
         </w:tc>
         <w:tc>
           <w:tcPr>
-            <w:tcW w:type="dxa" w:w="1400"/>
+            <w:tcW w:type="dxa" w:w="1550"/>
             <w:tcMar>
               <w:top w:type="dxa" w:w="72"/>
               <w:left w:type="dxa" w:w="95"/>
@@ -21242,13 +21653,13 @@
                 <w:sz w:val="17"/>
                 <w:szCs w:val="17"/>
               </w:rPr>
-              <w:t xml:space="preserve">Not stated</w:t>
-            </w:r>
-          </w:p>
-        </w:tc>
-        <w:tc>
-          <w:tcPr>
-            <w:tcW w:type="dxa" w:w="1300"/>
+              <w:t xml:space="preserve">697,412</w:t>
+            </w:r>
+          </w:p>
+        </w:tc>
+        <w:tc>
+          <w:tcPr>
+            <w:tcW w:type="dxa" w:w="1550"/>
             <w:tcMar>
               <w:top w:type="dxa" w:w="72"/>
               <w:left w:type="dxa" w:w="95"/>
@@ -21268,7 +21679,7 @@
                 <w:sz w:val="17"/>
                 <w:szCs w:val="17"/>
               </w:rPr>
-              <w:t xml:space="preserve">78.66%</w:t>
+              <w:t xml:space="preserve">871,492</w:t>
             </w:r>
           </w:p>
         </w:tc>
@@ -21279,7 +21690,7 @@
         </w:trPr>
         <w:tc>
           <w:tcPr>
-            <w:tcW w:type="dxa" w:w="2200"/>
+            <w:tcW w:type="dxa" w:w="1900"/>
             <w:shd w:fill="EFF3F9" w:color="auto" w:val="clear"/>
             <w:tcMar>
               <w:top w:type="dxa" w:w="72"/>
@@ -21306,7 +21717,7 @@
         </w:tc>
         <w:tc>
           <w:tcPr>
-            <w:tcW w:type="dxa" w:w="2100"/>
+            <w:tcW w:type="dxa" w:w="1900"/>
             <w:shd w:fill="EFF3F9" w:color="auto" w:val="clear"/>
             <w:tcMar>
               <w:top w:type="dxa" w:w="72"/>
@@ -21333,7 +21744,7 @@
         </w:tc>
         <w:tc>
           <w:tcPr>
-            <w:tcW w:type="dxa" w:w="2500"/>
+            <w:tcW w:type="dxa" w:w="2600"/>
             <w:shd w:fill="EFF3F9" w:color="auto" w:val="clear"/>
             <w:tcMar>
               <w:top w:type="dxa" w:w="72"/>
@@ -21360,7 +21771,7 @@
         </w:tc>
         <w:tc>
           <w:tcPr>
-            <w:tcW w:type="dxa" w:w="1400"/>
+            <w:tcW w:type="dxa" w:w="1550"/>
             <w:shd w:fill="EFF3F9" w:color="auto" w:val="clear"/>
             <w:tcMar>
               <w:top w:type="dxa" w:w="72"/>
@@ -21381,13 +21792,13 @@
                 <w:sz w:val="17"/>
                 <w:szCs w:val="17"/>
               </w:rPr>
-              <w:t xml:space="preserve">Not stated</w:t>
-            </w:r>
-          </w:p>
-        </w:tc>
-        <w:tc>
-          <w:tcPr>
-            <w:tcW w:type="dxa" w:w="1300"/>
+              <w:t xml:space="preserve">152,364</w:t>
+            </w:r>
+          </w:p>
+        </w:tc>
+        <w:tc>
+          <w:tcPr>
+            <w:tcW w:type="dxa" w:w="1550"/>
             <w:shd w:fill="EFF3F9" w:color="auto" w:val="clear"/>
             <w:tcMar>
               <w:top w:type="dxa" w:w="72"/>
@@ -21408,7 +21819,7 @@
                 <w:sz w:val="17"/>
                 <w:szCs w:val="17"/>
               </w:rPr>
-              <w:t xml:space="preserve">82.52%</w:t>
+              <w:t xml:space="preserve">153,004</w:t>
             </w:r>
           </w:p>
         </w:tc>
@@ -21419,7 +21830,7 @@
         </w:trPr>
         <w:tc>
           <w:tcPr>
-            <w:tcW w:type="dxa" w:w="2200"/>
+            <w:tcW w:type="dxa" w:w="1900"/>
             <w:tcMar>
               <w:top w:type="dxa" w:w="72"/>
               <w:left w:type="dxa" w:w="95"/>
@@ -21445,7 +21856,7 @@
         </w:tc>
         <w:tc>
           <w:tcPr>
-            <w:tcW w:type="dxa" w:w="2100"/>
+            <w:tcW w:type="dxa" w:w="1900"/>
             <w:tcMar>
               <w:top w:type="dxa" w:w="72"/>
               <w:left w:type="dxa" w:w="95"/>
@@ -21471,7 +21882,7 @@
         </w:tc>
         <w:tc>
           <w:tcPr>
-            <w:tcW w:type="dxa" w:w="2500"/>
+            <w:tcW w:type="dxa" w:w="2600"/>
             <w:tcMar>
               <w:top w:type="dxa" w:w="72"/>
               <w:left w:type="dxa" w:w="95"/>
@@ -21497,7 +21908,7 @@
         </w:tc>
         <w:tc>
           <w:tcPr>
-            <w:tcW w:type="dxa" w:w="1400"/>
+            <w:tcW w:type="dxa" w:w="1550"/>
             <w:tcMar>
               <w:top w:type="dxa" w:w="72"/>
               <w:left w:type="dxa" w:w="95"/>
@@ -21523,7 +21934,7 @@
         </w:tc>
         <w:tc>
           <w:tcPr>
-            <w:tcW w:type="dxa" w:w="1300"/>
+            <w:tcW w:type="dxa" w:w="1550"/>
             <w:tcMar>
               <w:top w:type="dxa" w:w="72"/>
               <w:left w:type="dxa" w:w="95"/>
@@ -21543,7 +21954,7 @@
                 <w:sz w:val="17"/>
                 <w:szCs w:val="17"/>
               </w:rPr>
-              <w:t xml:space="preserve">Approximately 68%</w:t>
+              <w:t xml:space="preserve">Not applicable</w:t>
             </w:r>
           </w:p>
         </w:tc>
@@ -21554,7 +21965,7 @@
         </w:trPr>
         <w:tc>
           <w:tcPr>
-            <w:tcW w:type="dxa" w:w="2200"/>
+            <w:tcW w:type="dxa" w:w="1900"/>
             <w:shd w:fill="F3F0FA" w:color="auto" w:val="clear"/>
             <w:tcMar>
               <w:top w:type="dxa" w:w="72"/>
@@ -21581,7 +21992,7 @@
         </w:tc>
         <w:tc>
           <w:tcPr>
-            <w:tcW w:type="dxa" w:w="2100"/>
+            <w:tcW w:type="dxa" w:w="1900"/>
             <w:shd w:fill="F3F0FA" w:color="auto" w:val="clear"/>
             <w:tcMar>
               <w:top w:type="dxa" w:w="72"/>
@@ -21608,7 +22019,7 @@
         </w:tc>
         <w:tc>
           <w:tcPr>
-            <w:tcW w:type="dxa" w:w="2500"/>
+            <w:tcW w:type="dxa" w:w="2600"/>
             <w:shd w:fill="F3F0FA" w:color="auto" w:val="clear"/>
             <w:tcMar>
               <w:top w:type="dxa" w:w="72"/>
@@ -21635,7 +22046,7 @@
         </w:tc>
         <w:tc>
           <w:tcPr>
-            <w:tcW w:type="dxa" w:w="1400"/>
+            <w:tcW w:type="dxa" w:w="1550"/>
             <w:shd w:fill="F3F0FA" w:color="auto" w:val="clear"/>
             <w:tcMar>
               <w:top w:type="dxa" w:w="72"/>
@@ -21662,7 +22073,7 @@
         </w:tc>
         <w:tc>
           <w:tcPr>
-            <w:tcW w:type="dxa" w:w="1300"/>
+            <w:tcW w:type="dxa" w:w="1550"/>
             <w:shd w:fill="F3F0FA" w:color="auto" w:val="clear"/>
             <w:tcMar>
               <w:top w:type="dxa" w:w="72"/>
@@ -21683,7 +22094,7 @@
                 <w:sz w:val="17"/>
                 <w:szCs w:val="17"/>
               </w:rPr>
-              <w:t xml:space="preserve">To be determined</w:t>
+              <w:t xml:space="preserve">—</w:t>
             </w:r>
           </w:p>
         </w:tc>
@@ -21701,7 +22112,3064 @@
           <w:sz w:val="17"/>
           <w:szCs w:val="17"/>
         </w:rPr>
-        <w:t xml:space="preserve">Table 15.1 — Baseline models and the proposed model. Accuracies are as reported by the respective authors. EEGNet appears with two figures because different papers report it differently.</w:t>
+        <w:t xml:space="preserve">Table 15.1 — Baseline models and the proposed model. Parameter counts are for 22 channels and four classes, from the braindecode 1.8.1 reference implementations, at this project's 875-sample input and at the 1,125-sample input of the ATCNet reference implementation. The 2,548 often quoted for EEGNet corresponds to a window of about 2.2 s. Published accuracies are given separately, in Table 15.2 for cross-subject evaluation and Table 15.3 for within-subject evaluation, because they come from different protocols.</w:t>
+      </w:r>
+    </w:p>
+    <w:p>
+      <w:pPr>
+        <w:spacing w:after="40"/>
+      </w:pPr>
+      <w:r>
+        <w:rPr>
+          <w:sz w:val="10"/>
+          <w:szCs w:val="10"/>
+        </w:rPr>
+        <w:t xml:space="preserve"/>
+      </w:r>
+    </w:p>
+    <w:tbl>
+      <w:tblPr>
+        <w:tblW w:type="dxa" w:w="9500"/>
+        <w:tblBorders>
+          <w:top w:val="single" w:color="auto" w:sz="4"/>
+          <w:left w:val="single" w:color="auto" w:sz="4"/>
+          <w:bottom w:val="single" w:color="auto" w:sz="4"/>
+          <w:right w:val="single" w:color="auto" w:sz="4"/>
+          <w:insideH w:val="single" w:color="auto" w:sz="4"/>
+          <w:insideV w:val="single" w:color="auto" w:sz="4"/>
+        </w:tblBorders>
+      </w:tblPr>
+      <w:tblGrid>
+        <w:gridCol w:w="1500"/>
+        <w:gridCol w:w="600"/>
+        <w:gridCol w:w="600"/>
+        <w:gridCol w:w="600"/>
+        <w:gridCol w:w="600"/>
+        <w:gridCol w:w="600"/>
+        <w:gridCol w:w="600"/>
+        <w:gridCol w:w="600"/>
+        <w:gridCol w:w="600"/>
+        <w:gridCol w:w="600"/>
+        <w:gridCol w:w="1500"/>
+        <w:gridCol w:w="1100"/>
+      </w:tblGrid>
+      <w:tr>
+        <w:trPr>
+          <w:cantSplit/>
+          <w:tblHeader/>
+        </w:trPr>
+        <w:tc>
+          <w:tcPr>
+            <w:tcW w:type="dxa" w:w="1500"/>
+            <w:shd w:fill="1B3A6B" w:color="auto" w:val="clear"/>
+            <w:tcMar>
+              <w:top w:type="dxa" w:w="72"/>
+              <w:left w:type="dxa" w:w="95"/>
+              <w:bottom w:type="dxa" w:w="72"/>
+              <w:right w:type="dxa" w:w="95"/>
+            </w:tcMar>
+          </w:tcPr>
+          <w:p>
+            <w:pPr>
+              <w:spacing w:after="0" w:line="248"/>
+              <w:jc w:val="left"/>
+            </w:pPr>
+            <w:r>
+              <w:rPr>
+                <w:b/>
+                <w:bCs/>
+                <w:color w:val="FFFFFF"/>
+                <w:sz w:val="18"/>
+                <w:szCs w:val="18"/>
+              </w:rPr>
+              <w:t xml:space="preserve">Model</w:t>
+            </w:r>
+          </w:p>
+        </w:tc>
+        <w:tc>
+          <w:tcPr>
+            <w:tcW w:type="dxa" w:w="600"/>
+            <w:shd w:fill="1B3A6B" w:color="auto" w:val="clear"/>
+            <w:tcMar>
+              <w:top w:type="dxa" w:w="72"/>
+              <w:left w:type="dxa" w:w="95"/>
+              <w:bottom w:type="dxa" w:w="72"/>
+              <w:right w:type="dxa" w:w="95"/>
+            </w:tcMar>
+          </w:tcPr>
+          <w:p>
+            <w:pPr>
+              <w:spacing w:after="0" w:line="248"/>
+              <w:jc w:val="center"/>
+            </w:pPr>
+            <w:r>
+              <w:rPr>
+                <w:b/>
+                <w:bCs/>
+                <w:color w:val="FFFFFF"/>
+                <w:sz w:val="18"/>
+                <w:szCs w:val="18"/>
+              </w:rPr>
+              <w:t xml:space="preserve">A01</w:t>
+            </w:r>
+          </w:p>
+        </w:tc>
+        <w:tc>
+          <w:tcPr>
+            <w:tcW w:type="dxa" w:w="600"/>
+            <w:shd w:fill="1B3A6B" w:color="auto" w:val="clear"/>
+            <w:tcMar>
+              <w:top w:type="dxa" w:w="72"/>
+              <w:left w:type="dxa" w:w="95"/>
+              <w:bottom w:type="dxa" w:w="72"/>
+              <w:right w:type="dxa" w:w="95"/>
+            </w:tcMar>
+          </w:tcPr>
+          <w:p>
+            <w:pPr>
+              <w:spacing w:after="0" w:line="248"/>
+              <w:jc w:val="center"/>
+            </w:pPr>
+            <w:r>
+              <w:rPr>
+                <w:b/>
+                <w:bCs/>
+                <w:color w:val="FFFFFF"/>
+                <w:sz w:val="18"/>
+                <w:szCs w:val="18"/>
+              </w:rPr>
+              <w:t xml:space="preserve">A02</w:t>
+            </w:r>
+          </w:p>
+        </w:tc>
+        <w:tc>
+          <w:tcPr>
+            <w:tcW w:type="dxa" w:w="600"/>
+            <w:shd w:fill="1B3A6B" w:color="auto" w:val="clear"/>
+            <w:tcMar>
+              <w:top w:type="dxa" w:w="72"/>
+              <w:left w:type="dxa" w:w="95"/>
+              <w:bottom w:type="dxa" w:w="72"/>
+              <w:right w:type="dxa" w:w="95"/>
+            </w:tcMar>
+          </w:tcPr>
+          <w:p>
+            <w:pPr>
+              <w:spacing w:after="0" w:line="248"/>
+              <w:jc w:val="center"/>
+            </w:pPr>
+            <w:r>
+              <w:rPr>
+                <w:b/>
+                <w:bCs/>
+                <w:color w:val="FFFFFF"/>
+                <w:sz w:val="18"/>
+                <w:szCs w:val="18"/>
+              </w:rPr>
+              <w:t xml:space="preserve">A03</w:t>
+            </w:r>
+          </w:p>
+        </w:tc>
+        <w:tc>
+          <w:tcPr>
+            <w:tcW w:type="dxa" w:w="600"/>
+            <w:shd w:fill="1B3A6B" w:color="auto" w:val="clear"/>
+            <w:tcMar>
+              <w:top w:type="dxa" w:w="72"/>
+              <w:left w:type="dxa" w:w="95"/>
+              <w:bottom w:type="dxa" w:w="72"/>
+              <w:right w:type="dxa" w:w="95"/>
+            </w:tcMar>
+          </w:tcPr>
+          <w:p>
+            <w:pPr>
+              <w:spacing w:after="0" w:line="248"/>
+              <w:jc w:val="center"/>
+            </w:pPr>
+            <w:r>
+              <w:rPr>
+                <w:b/>
+                <w:bCs/>
+                <w:color w:val="FFFFFF"/>
+                <w:sz w:val="18"/>
+                <w:szCs w:val="18"/>
+              </w:rPr>
+              <w:t xml:space="preserve">A04</w:t>
+            </w:r>
+          </w:p>
+        </w:tc>
+        <w:tc>
+          <w:tcPr>
+            <w:tcW w:type="dxa" w:w="600"/>
+            <w:shd w:fill="1B3A6B" w:color="auto" w:val="clear"/>
+            <w:tcMar>
+              <w:top w:type="dxa" w:w="72"/>
+              <w:left w:type="dxa" w:w="95"/>
+              <w:bottom w:type="dxa" w:w="72"/>
+              <w:right w:type="dxa" w:w="95"/>
+            </w:tcMar>
+          </w:tcPr>
+          <w:p>
+            <w:pPr>
+              <w:spacing w:after="0" w:line="248"/>
+              <w:jc w:val="center"/>
+            </w:pPr>
+            <w:r>
+              <w:rPr>
+                <w:b/>
+                <w:bCs/>
+                <w:color w:val="FFFFFF"/>
+                <w:sz w:val="18"/>
+                <w:szCs w:val="18"/>
+              </w:rPr>
+              <w:t xml:space="preserve">A05</w:t>
+            </w:r>
+          </w:p>
+        </w:tc>
+        <w:tc>
+          <w:tcPr>
+            <w:tcW w:type="dxa" w:w="600"/>
+            <w:shd w:fill="1B3A6B" w:color="auto" w:val="clear"/>
+            <w:tcMar>
+              <w:top w:type="dxa" w:w="72"/>
+              <w:left w:type="dxa" w:w="95"/>
+              <w:bottom w:type="dxa" w:w="72"/>
+              <w:right w:type="dxa" w:w="95"/>
+            </w:tcMar>
+          </w:tcPr>
+          <w:p>
+            <w:pPr>
+              <w:spacing w:after="0" w:line="248"/>
+              <w:jc w:val="center"/>
+            </w:pPr>
+            <w:r>
+              <w:rPr>
+                <w:b/>
+                <w:bCs/>
+                <w:color w:val="FFFFFF"/>
+                <w:sz w:val="18"/>
+                <w:szCs w:val="18"/>
+              </w:rPr>
+              <w:t xml:space="preserve">A06</w:t>
+            </w:r>
+          </w:p>
+        </w:tc>
+        <w:tc>
+          <w:tcPr>
+            <w:tcW w:type="dxa" w:w="600"/>
+            <w:shd w:fill="1B3A6B" w:color="auto" w:val="clear"/>
+            <w:tcMar>
+              <w:top w:type="dxa" w:w="72"/>
+              <w:left w:type="dxa" w:w="95"/>
+              <w:bottom w:type="dxa" w:w="72"/>
+              <w:right w:type="dxa" w:w="95"/>
+            </w:tcMar>
+          </w:tcPr>
+          <w:p>
+            <w:pPr>
+              <w:spacing w:after="0" w:line="248"/>
+              <w:jc w:val="center"/>
+            </w:pPr>
+            <w:r>
+              <w:rPr>
+                <w:b/>
+                <w:bCs/>
+                <w:color w:val="FFFFFF"/>
+                <w:sz w:val="18"/>
+                <w:szCs w:val="18"/>
+              </w:rPr>
+              <w:t xml:space="preserve">A07</w:t>
+            </w:r>
+          </w:p>
+        </w:tc>
+        <w:tc>
+          <w:tcPr>
+            <w:tcW w:type="dxa" w:w="600"/>
+            <w:shd w:fill="1B3A6B" w:color="auto" w:val="clear"/>
+            <w:tcMar>
+              <w:top w:type="dxa" w:w="72"/>
+              <w:left w:type="dxa" w:w="95"/>
+              <w:bottom w:type="dxa" w:w="72"/>
+              <w:right w:type="dxa" w:w="95"/>
+            </w:tcMar>
+          </w:tcPr>
+          <w:p>
+            <w:pPr>
+              <w:spacing w:after="0" w:line="248"/>
+              <w:jc w:val="center"/>
+            </w:pPr>
+            <w:r>
+              <w:rPr>
+                <w:b/>
+                <w:bCs/>
+                <w:color w:val="FFFFFF"/>
+                <w:sz w:val="18"/>
+                <w:szCs w:val="18"/>
+              </w:rPr>
+              <w:t xml:space="preserve">A08</w:t>
+            </w:r>
+          </w:p>
+        </w:tc>
+        <w:tc>
+          <w:tcPr>
+            <w:tcW w:type="dxa" w:w="600"/>
+            <w:shd w:fill="1B3A6B" w:color="auto" w:val="clear"/>
+            <w:tcMar>
+              <w:top w:type="dxa" w:w="72"/>
+              <w:left w:type="dxa" w:w="95"/>
+              <w:bottom w:type="dxa" w:w="72"/>
+              <w:right w:type="dxa" w:w="95"/>
+            </w:tcMar>
+          </w:tcPr>
+          <w:p>
+            <w:pPr>
+              <w:spacing w:after="0" w:line="248"/>
+              <w:jc w:val="center"/>
+            </w:pPr>
+            <w:r>
+              <w:rPr>
+                <w:b/>
+                <w:bCs/>
+                <w:color w:val="FFFFFF"/>
+                <w:sz w:val="18"/>
+                <w:szCs w:val="18"/>
+              </w:rPr>
+              <w:t xml:space="preserve">A09</w:t>
+            </w:r>
+          </w:p>
+        </w:tc>
+        <w:tc>
+          <w:tcPr>
+            <w:tcW w:type="dxa" w:w="1500"/>
+            <w:shd w:fill="1B3A6B" w:color="auto" w:val="clear"/>
+            <w:tcMar>
+              <w:top w:type="dxa" w:w="72"/>
+              <w:left w:type="dxa" w:w="95"/>
+              <w:bottom w:type="dxa" w:w="72"/>
+              <w:right w:type="dxa" w:w="95"/>
+            </w:tcMar>
+          </w:tcPr>
+          <w:p>
+            <w:pPr>
+              <w:spacing w:after="0" w:line="248"/>
+              <w:jc w:val="center"/>
+            </w:pPr>
+            <w:r>
+              <w:rPr>
+                <w:b/>
+                <w:bCs/>
+                <w:color w:val="FFFFFF"/>
+                <w:sz w:val="18"/>
+                <w:szCs w:val="18"/>
+              </w:rPr>
+              <w:t xml:space="preserve">Mean ± std</w:t>
+            </w:r>
+          </w:p>
+        </w:tc>
+        <w:tc>
+          <w:tcPr>
+            <w:tcW w:type="dxa" w:w="1100"/>
+            <w:shd w:fill="1B3A6B" w:color="auto" w:val="clear"/>
+            <w:tcMar>
+              <w:top w:type="dxa" w:w="72"/>
+              <w:left w:type="dxa" w:w="95"/>
+              <w:bottom w:type="dxa" w:w="72"/>
+              <w:right w:type="dxa" w:w="95"/>
+            </w:tcMar>
+          </w:tcPr>
+          <w:p>
+            <w:pPr>
+              <w:spacing w:after="0" w:line="248"/>
+              <w:jc w:val="center"/>
+            </w:pPr>
+            <w:r>
+              <w:rPr>
+                <w:b/>
+                <w:bCs/>
+                <w:color w:val="FFFFFF"/>
+                <w:sz w:val="18"/>
+                <w:szCs w:val="18"/>
+              </w:rPr>
+              <w:t xml:space="preserve">Kappa</w:t>
+            </w:r>
+          </w:p>
+        </w:tc>
+      </w:tr>
+      <w:tr>
+        <w:trPr>
+          <w:cantSplit/>
+        </w:trPr>
+        <w:tc>
+          <w:tcPr>
+            <w:tcW w:type="dxa" w:w="1500"/>
+            <w:tcMar>
+              <w:top w:type="dxa" w:w="72"/>
+              <w:left w:type="dxa" w:w="95"/>
+              <w:bottom w:type="dxa" w:w="72"/>
+              <w:right w:type="dxa" w:w="95"/>
+            </w:tcMar>
+          </w:tcPr>
+          <w:p>
+            <w:pPr>
+              <w:spacing w:after="0" w:line="248"/>
+              <w:jc w:val="left"/>
+            </w:pPr>
+            <w:r>
+              <w:rPr>
+                <w:b/>
+                <w:bCs/>
+                <w:sz w:val="15"/>
+                <w:szCs w:val="15"/>
+              </w:rPr>
+              <w:t xml:space="preserve">ShallowConvNet+</w:t>
+            </w:r>
+          </w:p>
+        </w:tc>
+        <w:tc>
+          <w:tcPr>
+            <w:tcW w:type="dxa" w:w="600"/>
+            <w:tcMar>
+              <w:top w:type="dxa" w:w="72"/>
+              <w:left w:type="dxa" w:w="95"/>
+              <w:bottom w:type="dxa" w:w="72"/>
+              <w:right w:type="dxa" w:w="95"/>
+            </w:tcMar>
+          </w:tcPr>
+          <w:p>
+            <w:pPr>
+              <w:spacing w:after="0" w:line="248"/>
+              <w:jc w:val="center"/>
+            </w:pPr>
+            <w:r>
+              <w:rPr>
+                <w:b w:val="false"/>
+                <w:bCs w:val="false"/>
+                <w:sz w:val="15"/>
+                <w:szCs w:val="15"/>
+              </w:rPr>
+              <w:t xml:space="preserve">66.84</w:t>
+            </w:r>
+          </w:p>
+        </w:tc>
+        <w:tc>
+          <w:tcPr>
+            <w:tcW w:type="dxa" w:w="600"/>
+            <w:tcMar>
+              <w:top w:type="dxa" w:w="72"/>
+              <w:left w:type="dxa" w:w="95"/>
+              <w:bottom w:type="dxa" w:w="72"/>
+              <w:right w:type="dxa" w:w="95"/>
+            </w:tcMar>
+          </w:tcPr>
+          <w:p>
+            <w:pPr>
+              <w:spacing w:after="0" w:line="248"/>
+              <w:jc w:val="center"/>
+            </w:pPr>
+            <w:r>
+              <w:rPr>
+                <w:b w:val="false"/>
+                <w:bCs w:val="false"/>
+                <w:sz w:val="15"/>
+                <w:szCs w:val="15"/>
+              </w:rPr>
+              <w:t xml:space="preserve">46.53</w:t>
+            </w:r>
+          </w:p>
+        </w:tc>
+        <w:tc>
+          <w:tcPr>
+            <w:tcW w:type="dxa" w:w="600"/>
+            <w:tcMar>
+              <w:top w:type="dxa" w:w="72"/>
+              <w:left w:type="dxa" w:w="95"/>
+              <w:bottom w:type="dxa" w:w="72"/>
+              <w:right w:type="dxa" w:w="95"/>
+            </w:tcMar>
+          </w:tcPr>
+          <w:p>
+            <w:pPr>
+              <w:spacing w:after="0" w:line="248"/>
+              <w:jc w:val="center"/>
+            </w:pPr>
+            <w:r>
+              <w:rPr>
+                <w:b w:val="false"/>
+                <w:bCs w:val="false"/>
+                <w:sz w:val="15"/>
+                <w:szCs w:val="15"/>
+              </w:rPr>
+              <w:t xml:space="preserve">67.53</w:t>
+            </w:r>
+          </w:p>
+        </w:tc>
+        <w:tc>
+          <w:tcPr>
+            <w:tcW w:type="dxa" w:w="600"/>
+            <w:tcMar>
+              <w:top w:type="dxa" w:w="72"/>
+              <w:left w:type="dxa" w:w="95"/>
+              <w:bottom w:type="dxa" w:w="72"/>
+              <w:right w:type="dxa" w:w="95"/>
+            </w:tcMar>
+          </w:tcPr>
+          <w:p>
+            <w:pPr>
+              <w:spacing w:after="0" w:line="248"/>
+              <w:jc w:val="center"/>
+            </w:pPr>
+            <w:r>
+              <w:rPr>
+                <w:b w:val="false"/>
+                <w:bCs w:val="false"/>
+                <w:sz w:val="15"/>
+                <w:szCs w:val="15"/>
+              </w:rPr>
+              <w:t xml:space="preserve">52.26</w:t>
+            </w:r>
+          </w:p>
+        </w:tc>
+        <w:tc>
+          <w:tcPr>
+            <w:tcW w:type="dxa" w:w="600"/>
+            <w:tcMar>
+              <w:top w:type="dxa" w:w="72"/>
+              <w:left w:type="dxa" w:w="95"/>
+              <w:bottom w:type="dxa" w:w="72"/>
+              <w:right w:type="dxa" w:w="95"/>
+            </w:tcMar>
+          </w:tcPr>
+          <w:p>
+            <w:pPr>
+              <w:spacing w:after="0" w:line="248"/>
+              <w:jc w:val="center"/>
+            </w:pPr>
+            <w:r>
+              <w:rPr>
+                <w:b w:val="false"/>
+                <w:bCs w:val="false"/>
+                <w:sz w:val="15"/>
+                <w:szCs w:val="15"/>
+              </w:rPr>
+              <w:t xml:space="preserve">34.38</w:t>
+            </w:r>
+          </w:p>
+        </w:tc>
+        <w:tc>
+          <w:tcPr>
+            <w:tcW w:type="dxa" w:w="600"/>
+            <w:tcMar>
+              <w:top w:type="dxa" w:w="72"/>
+              <w:left w:type="dxa" w:w="95"/>
+              <w:bottom w:type="dxa" w:w="72"/>
+              <w:right w:type="dxa" w:w="95"/>
+            </w:tcMar>
+          </w:tcPr>
+          <w:p>
+            <w:pPr>
+              <w:spacing w:after="0" w:line="248"/>
+              <w:jc w:val="center"/>
+            </w:pPr>
+            <w:r>
+              <w:rPr>
+                <w:b w:val="false"/>
+                <w:bCs w:val="false"/>
+                <w:sz w:val="15"/>
+                <w:szCs w:val="15"/>
+              </w:rPr>
+              <w:t xml:space="preserve">39.76</w:t>
+            </w:r>
+          </w:p>
+        </w:tc>
+        <w:tc>
+          <w:tcPr>
+            <w:tcW w:type="dxa" w:w="600"/>
+            <w:tcMar>
+              <w:top w:type="dxa" w:w="72"/>
+              <w:left w:type="dxa" w:w="95"/>
+              <w:bottom w:type="dxa" w:w="72"/>
+              <w:right w:type="dxa" w:w="95"/>
+            </w:tcMar>
+          </w:tcPr>
+          <w:p>
+            <w:pPr>
+              <w:spacing w:after="0" w:line="248"/>
+              <w:jc w:val="center"/>
+            </w:pPr>
+            <w:r>
+              <w:rPr>
+                <w:b w:val="false"/>
+                <w:bCs w:val="false"/>
+                <w:sz w:val="15"/>
+                <w:szCs w:val="15"/>
+              </w:rPr>
+              <w:t xml:space="preserve">65.45</w:t>
+            </w:r>
+          </w:p>
+        </w:tc>
+        <w:tc>
+          <w:tcPr>
+            <w:tcW w:type="dxa" w:w="600"/>
+            <w:tcMar>
+              <w:top w:type="dxa" w:w="72"/>
+              <w:left w:type="dxa" w:w="95"/>
+              <w:bottom w:type="dxa" w:w="72"/>
+              <w:right w:type="dxa" w:w="95"/>
+            </w:tcMar>
+          </w:tcPr>
+          <w:p>
+            <w:pPr>
+              <w:spacing w:after="0" w:line="248"/>
+              <w:jc w:val="center"/>
+            </w:pPr>
+            <w:r>
+              <w:rPr>
+                <w:b w:val="false"/>
+                <w:bCs w:val="false"/>
+                <w:sz w:val="15"/>
+                <w:szCs w:val="15"/>
+              </w:rPr>
+              <w:t xml:space="preserve">71.18</w:t>
+            </w:r>
+          </w:p>
+        </w:tc>
+        <w:tc>
+          <w:tcPr>
+            <w:tcW w:type="dxa" w:w="600"/>
+            <w:tcMar>
+              <w:top w:type="dxa" w:w="72"/>
+              <w:left w:type="dxa" w:w="95"/>
+              <w:bottom w:type="dxa" w:w="72"/>
+              <w:right w:type="dxa" w:w="95"/>
+            </w:tcMar>
+          </w:tcPr>
+          <w:p>
+            <w:pPr>
+              <w:spacing w:after="0" w:line="248"/>
+              <w:jc w:val="center"/>
+            </w:pPr>
+            <w:r>
+              <w:rPr>
+                <w:b w:val="false"/>
+                <w:bCs w:val="false"/>
+                <w:sz w:val="15"/>
+                <w:szCs w:val="15"/>
+              </w:rPr>
+              <w:t xml:space="preserve">66.84</w:t>
+            </w:r>
+          </w:p>
+        </w:tc>
+        <w:tc>
+          <w:tcPr>
+            <w:tcW w:type="dxa" w:w="1500"/>
+            <w:tcMar>
+              <w:top w:type="dxa" w:w="72"/>
+              <w:left w:type="dxa" w:w="95"/>
+              <w:bottom w:type="dxa" w:w="72"/>
+              <w:right w:type="dxa" w:w="95"/>
+            </w:tcMar>
+          </w:tcPr>
+          <w:p>
+            <w:pPr>
+              <w:spacing w:after="0" w:line="248"/>
+              <w:jc w:val="center"/>
+            </w:pPr>
+            <w:r>
+              <w:rPr>
+                <w:b w:val="false"/>
+                <w:bCs w:val="false"/>
+                <w:sz w:val="15"/>
+                <w:szCs w:val="15"/>
+              </w:rPr>
+              <w:t xml:space="preserve">56.75 ± 13.77</w:t>
+            </w:r>
+          </w:p>
+        </w:tc>
+        <w:tc>
+          <w:tcPr>
+            <w:tcW w:type="dxa" w:w="1100"/>
+            <w:tcMar>
+              <w:top w:type="dxa" w:w="72"/>
+              <w:left w:type="dxa" w:w="95"/>
+              <w:bottom w:type="dxa" w:w="72"/>
+              <w:right w:type="dxa" w:w="95"/>
+            </w:tcMar>
+          </w:tcPr>
+          <w:p>
+            <w:pPr>
+              <w:spacing w:after="0" w:line="248"/>
+              <w:jc w:val="center"/>
+            </w:pPr>
+            <w:r>
+              <w:rPr>
+                <w:b w:val="false"/>
+                <w:bCs w:val="false"/>
+                <w:sz w:val="15"/>
+                <w:szCs w:val="15"/>
+              </w:rPr>
+              <w:t xml:space="preserve">0.4234</w:t>
+            </w:r>
+          </w:p>
+        </w:tc>
+      </w:tr>
+      <w:tr>
+        <w:trPr>
+          <w:cantSplit/>
+        </w:trPr>
+        <w:tc>
+          <w:tcPr>
+            <w:tcW w:type="dxa" w:w="1500"/>
+            <w:shd w:fill="EFF3F9" w:color="auto" w:val="clear"/>
+            <w:tcMar>
+              <w:top w:type="dxa" w:w="72"/>
+              <w:left w:type="dxa" w:w="95"/>
+              <w:bottom w:type="dxa" w:w="72"/>
+              <w:right w:type="dxa" w:w="95"/>
+            </w:tcMar>
+          </w:tcPr>
+          <w:p>
+            <w:pPr>
+              <w:spacing w:after="0" w:line="248"/>
+              <w:jc w:val="left"/>
+            </w:pPr>
+            <w:r>
+              <w:rPr>
+                <w:b/>
+                <w:bCs/>
+                <w:sz w:val="15"/>
+                <w:szCs w:val="15"/>
+              </w:rPr>
+              <w:t xml:space="preserve">DeepConvNet+</w:t>
+            </w:r>
+          </w:p>
+        </w:tc>
+        <w:tc>
+          <w:tcPr>
+            <w:tcW w:type="dxa" w:w="600"/>
+            <w:shd w:fill="EFF3F9" w:color="auto" w:val="clear"/>
+            <w:tcMar>
+              <w:top w:type="dxa" w:w="72"/>
+              <w:left w:type="dxa" w:w="95"/>
+              <w:bottom w:type="dxa" w:w="72"/>
+              <w:right w:type="dxa" w:w="95"/>
+            </w:tcMar>
+          </w:tcPr>
+          <w:p>
+            <w:pPr>
+              <w:spacing w:after="0" w:line="248"/>
+              <w:jc w:val="center"/>
+            </w:pPr>
+            <w:r>
+              <w:rPr>
+                <w:b w:val="false"/>
+                <w:bCs w:val="false"/>
+                <w:sz w:val="15"/>
+                <w:szCs w:val="15"/>
+              </w:rPr>
+              <w:t xml:space="preserve">68.58</w:t>
+            </w:r>
+          </w:p>
+        </w:tc>
+        <w:tc>
+          <w:tcPr>
+            <w:tcW w:type="dxa" w:w="600"/>
+            <w:shd w:fill="EFF3F9" w:color="auto" w:val="clear"/>
+            <w:tcMar>
+              <w:top w:type="dxa" w:w="72"/>
+              <w:left w:type="dxa" w:w="95"/>
+              <w:bottom w:type="dxa" w:w="72"/>
+              <w:right w:type="dxa" w:w="95"/>
+            </w:tcMar>
+          </w:tcPr>
+          <w:p>
+            <w:pPr>
+              <w:spacing w:after="0" w:line="248"/>
+              <w:jc w:val="center"/>
+            </w:pPr>
+            <w:r>
+              <w:rPr>
+                <w:b w:val="false"/>
+                <w:bCs w:val="false"/>
+                <w:sz w:val="15"/>
+                <w:szCs w:val="15"/>
+              </w:rPr>
+              <w:t xml:space="preserve">47.40</w:t>
+            </w:r>
+          </w:p>
+        </w:tc>
+        <w:tc>
+          <w:tcPr>
+            <w:tcW w:type="dxa" w:w="600"/>
+            <w:shd w:fill="EFF3F9" w:color="auto" w:val="clear"/>
+            <w:tcMar>
+              <w:top w:type="dxa" w:w="72"/>
+              <w:left w:type="dxa" w:w="95"/>
+              <w:bottom w:type="dxa" w:w="72"/>
+              <w:right w:type="dxa" w:w="95"/>
+            </w:tcMar>
+          </w:tcPr>
+          <w:p>
+            <w:pPr>
+              <w:spacing w:after="0" w:line="248"/>
+              <w:jc w:val="center"/>
+            </w:pPr>
+            <w:r>
+              <w:rPr>
+                <w:b w:val="false"/>
+                <w:bCs w:val="false"/>
+                <w:sz w:val="15"/>
+                <w:szCs w:val="15"/>
+              </w:rPr>
+              <w:t xml:space="preserve">78.99</w:t>
+            </w:r>
+          </w:p>
+        </w:tc>
+        <w:tc>
+          <w:tcPr>
+            <w:tcW w:type="dxa" w:w="600"/>
+            <w:shd w:fill="EFF3F9" w:color="auto" w:val="clear"/>
+            <w:tcMar>
+              <w:top w:type="dxa" w:w="72"/>
+              <w:left w:type="dxa" w:w="95"/>
+              <w:bottom w:type="dxa" w:w="72"/>
+              <w:right w:type="dxa" w:w="95"/>
+            </w:tcMar>
+          </w:tcPr>
+          <w:p>
+            <w:pPr>
+              <w:spacing w:after="0" w:line="248"/>
+              <w:jc w:val="center"/>
+            </w:pPr>
+            <w:r>
+              <w:rPr>
+                <w:b w:val="false"/>
+                <w:bCs w:val="false"/>
+                <w:sz w:val="15"/>
+                <w:szCs w:val="15"/>
+              </w:rPr>
+              <w:t xml:space="preserve">52.26</w:t>
+            </w:r>
+          </w:p>
+        </w:tc>
+        <w:tc>
+          <w:tcPr>
+            <w:tcW w:type="dxa" w:w="600"/>
+            <w:shd w:fill="EFF3F9" w:color="auto" w:val="clear"/>
+            <w:tcMar>
+              <w:top w:type="dxa" w:w="72"/>
+              <w:left w:type="dxa" w:w="95"/>
+              <w:bottom w:type="dxa" w:w="72"/>
+              <w:right w:type="dxa" w:w="95"/>
+            </w:tcMar>
+          </w:tcPr>
+          <w:p>
+            <w:pPr>
+              <w:spacing w:after="0" w:line="248"/>
+              <w:jc w:val="center"/>
+            </w:pPr>
+            <w:r>
+              <w:rPr>
+                <w:b w:val="false"/>
+                <w:bCs w:val="false"/>
+                <w:sz w:val="15"/>
+                <w:szCs w:val="15"/>
+              </w:rPr>
+              <w:t xml:space="preserve">50.87</w:t>
+            </w:r>
+          </w:p>
+        </w:tc>
+        <w:tc>
+          <w:tcPr>
+            <w:tcW w:type="dxa" w:w="600"/>
+            <w:shd w:fill="EFF3F9" w:color="auto" w:val="clear"/>
+            <w:tcMar>
+              <w:top w:type="dxa" w:w="72"/>
+              <w:left w:type="dxa" w:w="95"/>
+              <w:bottom w:type="dxa" w:w="72"/>
+              <w:right w:type="dxa" w:w="95"/>
+            </w:tcMar>
+          </w:tcPr>
+          <w:p>
+            <w:pPr>
+              <w:spacing w:after="0" w:line="248"/>
+              <w:jc w:val="center"/>
+            </w:pPr>
+            <w:r>
+              <w:rPr>
+                <w:b w:val="false"/>
+                <w:bCs w:val="false"/>
+                <w:sz w:val="15"/>
+                <w:szCs w:val="15"/>
+              </w:rPr>
+              <w:t xml:space="preserve">41.84</w:t>
+            </w:r>
+          </w:p>
+        </w:tc>
+        <w:tc>
+          <w:tcPr>
+            <w:tcW w:type="dxa" w:w="600"/>
+            <w:shd w:fill="EFF3F9" w:color="auto" w:val="clear"/>
+            <w:tcMar>
+              <w:top w:type="dxa" w:w="72"/>
+              <w:left w:type="dxa" w:w="95"/>
+              <w:bottom w:type="dxa" w:w="72"/>
+              <w:right w:type="dxa" w:w="95"/>
+            </w:tcMar>
+          </w:tcPr>
+          <w:p>
+            <w:pPr>
+              <w:spacing w:after="0" w:line="248"/>
+              <w:jc w:val="center"/>
+            </w:pPr>
+            <w:r>
+              <w:rPr>
+                <w:b w:val="false"/>
+                <w:bCs w:val="false"/>
+                <w:sz w:val="15"/>
+                <w:szCs w:val="15"/>
+              </w:rPr>
+              <w:t xml:space="preserve">69.44</w:t>
+            </w:r>
+          </w:p>
+        </w:tc>
+        <w:tc>
+          <w:tcPr>
+            <w:tcW w:type="dxa" w:w="600"/>
+            <w:shd w:fill="EFF3F9" w:color="auto" w:val="clear"/>
+            <w:tcMar>
+              <w:top w:type="dxa" w:w="72"/>
+              <w:left w:type="dxa" w:w="95"/>
+              <w:bottom w:type="dxa" w:w="72"/>
+              <w:right w:type="dxa" w:w="95"/>
+            </w:tcMar>
+          </w:tcPr>
+          <w:p>
+            <w:pPr>
+              <w:spacing w:after="0" w:line="248"/>
+              <w:jc w:val="center"/>
+            </w:pPr>
+            <w:r>
+              <w:rPr>
+                <w:b w:val="false"/>
+                <w:bCs w:val="false"/>
+                <w:sz w:val="15"/>
+                <w:szCs w:val="15"/>
+              </w:rPr>
+              <w:t xml:space="preserve">71.70</w:t>
+            </w:r>
+          </w:p>
+        </w:tc>
+        <w:tc>
+          <w:tcPr>
+            <w:tcW w:type="dxa" w:w="600"/>
+            <w:shd w:fill="EFF3F9" w:color="auto" w:val="clear"/>
+            <w:tcMar>
+              <w:top w:type="dxa" w:w="72"/>
+              <w:left w:type="dxa" w:w="95"/>
+              <w:bottom w:type="dxa" w:w="72"/>
+              <w:right w:type="dxa" w:w="95"/>
+            </w:tcMar>
+          </w:tcPr>
+          <w:p>
+            <w:pPr>
+              <w:spacing w:after="0" w:line="248"/>
+              <w:jc w:val="center"/>
+            </w:pPr>
+            <w:r>
+              <w:rPr>
+                <w:b w:val="false"/>
+                <w:bCs w:val="false"/>
+                <w:sz w:val="15"/>
+                <w:szCs w:val="15"/>
+              </w:rPr>
+              <w:t xml:space="preserve">60.24</w:t>
+            </w:r>
+          </w:p>
+        </w:tc>
+        <w:tc>
+          <w:tcPr>
+            <w:tcW w:type="dxa" w:w="1500"/>
+            <w:shd w:fill="EFF3F9" w:color="auto" w:val="clear"/>
+            <w:tcMar>
+              <w:top w:type="dxa" w:w="72"/>
+              <w:left w:type="dxa" w:w="95"/>
+              <w:bottom w:type="dxa" w:w="72"/>
+              <w:right w:type="dxa" w:w="95"/>
+            </w:tcMar>
+          </w:tcPr>
+          <w:p>
+            <w:pPr>
+              <w:spacing w:after="0" w:line="248"/>
+              <w:jc w:val="center"/>
+            </w:pPr>
+            <w:r>
+              <w:rPr>
+                <w:b w:val="false"/>
+                <w:bCs w:val="false"/>
+                <w:sz w:val="15"/>
+                <w:szCs w:val="15"/>
+              </w:rPr>
+              <w:t xml:space="preserve">60.15 ± 12.71</w:t>
+            </w:r>
+          </w:p>
+        </w:tc>
+        <w:tc>
+          <w:tcPr>
+            <w:tcW w:type="dxa" w:w="1100"/>
+            <w:shd w:fill="EFF3F9" w:color="auto" w:val="clear"/>
+            <w:tcMar>
+              <w:top w:type="dxa" w:w="72"/>
+              <w:left w:type="dxa" w:w="95"/>
+              <w:bottom w:type="dxa" w:w="72"/>
+              <w:right w:type="dxa" w:w="95"/>
+            </w:tcMar>
+          </w:tcPr>
+          <w:p>
+            <w:pPr>
+              <w:spacing w:after="0" w:line="248"/>
+              <w:jc w:val="center"/>
+            </w:pPr>
+            <w:r>
+              <w:rPr>
+                <w:b w:val="false"/>
+                <w:bCs w:val="false"/>
+                <w:sz w:val="15"/>
+                <w:szCs w:val="15"/>
+              </w:rPr>
+              <w:t xml:space="preserve">0.4686</w:t>
+            </w:r>
+          </w:p>
+        </w:tc>
+      </w:tr>
+      <w:tr>
+        <w:trPr>
+          <w:cantSplit/>
+        </w:trPr>
+        <w:tc>
+          <w:tcPr>
+            <w:tcW w:type="dxa" w:w="1500"/>
+            <w:tcMar>
+              <w:top w:type="dxa" w:w="72"/>
+              <w:left w:type="dxa" w:w="95"/>
+              <w:bottom w:type="dxa" w:w="72"/>
+              <w:right w:type="dxa" w:w="95"/>
+            </w:tcMar>
+          </w:tcPr>
+          <w:p>
+            <w:pPr>
+              <w:spacing w:after="0" w:line="248"/>
+              <w:jc w:val="left"/>
+            </w:pPr>
+            <w:r>
+              <w:rPr>
+                <w:b/>
+                <w:bCs/>
+                <w:sz w:val="15"/>
+                <w:szCs w:val="15"/>
+              </w:rPr>
+              <w:t xml:space="preserve">EEGNet+</w:t>
+            </w:r>
+          </w:p>
+        </w:tc>
+        <w:tc>
+          <w:tcPr>
+            <w:tcW w:type="dxa" w:w="600"/>
+            <w:tcMar>
+              <w:top w:type="dxa" w:w="72"/>
+              <w:left w:type="dxa" w:w="95"/>
+              <w:bottom w:type="dxa" w:w="72"/>
+              <w:right w:type="dxa" w:w="95"/>
+            </w:tcMar>
+          </w:tcPr>
+          <w:p>
+            <w:pPr>
+              <w:spacing w:after="0" w:line="248"/>
+              <w:jc w:val="center"/>
+            </w:pPr>
+            <w:r>
+              <w:rPr>
+                <w:b w:val="false"/>
+                <w:bCs w:val="false"/>
+                <w:sz w:val="15"/>
+                <w:szCs w:val="15"/>
+              </w:rPr>
+              <w:t xml:space="preserve">69.79</w:t>
+            </w:r>
+          </w:p>
+        </w:tc>
+        <w:tc>
+          <w:tcPr>
+            <w:tcW w:type="dxa" w:w="600"/>
+            <w:tcMar>
+              <w:top w:type="dxa" w:w="72"/>
+              <w:left w:type="dxa" w:w="95"/>
+              <w:bottom w:type="dxa" w:w="72"/>
+              <w:right w:type="dxa" w:w="95"/>
+            </w:tcMar>
+          </w:tcPr>
+          <w:p>
+            <w:pPr>
+              <w:spacing w:after="0" w:line="248"/>
+              <w:jc w:val="center"/>
+            </w:pPr>
+            <w:r>
+              <w:rPr>
+                <w:b w:val="false"/>
+                <w:bCs w:val="false"/>
+                <w:sz w:val="15"/>
+                <w:szCs w:val="15"/>
+              </w:rPr>
+              <w:t xml:space="preserve">42.01</w:t>
+            </w:r>
+          </w:p>
+        </w:tc>
+        <w:tc>
+          <w:tcPr>
+            <w:tcW w:type="dxa" w:w="600"/>
+            <w:tcMar>
+              <w:top w:type="dxa" w:w="72"/>
+              <w:left w:type="dxa" w:w="95"/>
+              <w:bottom w:type="dxa" w:w="72"/>
+              <w:right w:type="dxa" w:w="95"/>
+            </w:tcMar>
+          </w:tcPr>
+          <w:p>
+            <w:pPr>
+              <w:spacing w:after="0" w:line="248"/>
+              <w:jc w:val="center"/>
+            </w:pPr>
+            <w:r>
+              <w:rPr>
+                <w:b w:val="false"/>
+                <w:bCs w:val="false"/>
+                <w:sz w:val="15"/>
+                <w:szCs w:val="15"/>
+              </w:rPr>
+              <w:t xml:space="preserve">79.51</w:t>
+            </w:r>
+          </w:p>
+        </w:tc>
+        <w:tc>
+          <w:tcPr>
+            <w:tcW w:type="dxa" w:w="600"/>
+            <w:tcMar>
+              <w:top w:type="dxa" w:w="72"/>
+              <w:left w:type="dxa" w:w="95"/>
+              <w:bottom w:type="dxa" w:w="72"/>
+              <w:right w:type="dxa" w:w="95"/>
+            </w:tcMar>
+          </w:tcPr>
+          <w:p>
+            <w:pPr>
+              <w:spacing w:after="0" w:line="248"/>
+              <w:jc w:val="center"/>
+            </w:pPr>
+            <w:r>
+              <w:rPr>
+                <w:b w:val="false"/>
+                <w:bCs w:val="false"/>
+                <w:sz w:val="15"/>
+                <w:szCs w:val="15"/>
+              </w:rPr>
+              <w:t xml:space="preserve">50.87</w:t>
+            </w:r>
+          </w:p>
+        </w:tc>
+        <w:tc>
+          <w:tcPr>
+            <w:tcW w:type="dxa" w:w="600"/>
+            <w:tcMar>
+              <w:top w:type="dxa" w:w="72"/>
+              <w:left w:type="dxa" w:w="95"/>
+              <w:bottom w:type="dxa" w:w="72"/>
+              <w:right w:type="dxa" w:w="95"/>
+            </w:tcMar>
+          </w:tcPr>
+          <w:p>
+            <w:pPr>
+              <w:spacing w:after="0" w:line="248"/>
+              <w:jc w:val="center"/>
+            </w:pPr>
+            <w:r>
+              <w:rPr>
+                <w:b w:val="false"/>
+                <w:bCs w:val="false"/>
+                <w:sz w:val="15"/>
+                <w:szCs w:val="15"/>
+              </w:rPr>
+              <w:t xml:space="preserve">35.76</w:t>
+            </w:r>
+          </w:p>
+        </w:tc>
+        <w:tc>
+          <w:tcPr>
+            <w:tcW w:type="dxa" w:w="600"/>
+            <w:tcMar>
+              <w:top w:type="dxa" w:w="72"/>
+              <w:left w:type="dxa" w:w="95"/>
+              <w:bottom w:type="dxa" w:w="72"/>
+              <w:right w:type="dxa" w:w="95"/>
+            </w:tcMar>
+          </w:tcPr>
+          <w:p>
+            <w:pPr>
+              <w:spacing w:after="0" w:line="248"/>
+              <w:jc w:val="center"/>
+            </w:pPr>
+            <w:r>
+              <w:rPr>
+                <w:b w:val="false"/>
+                <w:bCs w:val="false"/>
+                <w:sz w:val="15"/>
+                <w:szCs w:val="15"/>
+              </w:rPr>
+              <w:t xml:space="preserve">37.15</w:t>
+            </w:r>
+          </w:p>
+        </w:tc>
+        <w:tc>
+          <w:tcPr>
+            <w:tcW w:type="dxa" w:w="600"/>
+            <w:tcMar>
+              <w:top w:type="dxa" w:w="72"/>
+              <w:left w:type="dxa" w:w="95"/>
+              <w:bottom w:type="dxa" w:w="72"/>
+              <w:right w:type="dxa" w:w="95"/>
+            </w:tcMar>
+          </w:tcPr>
+          <w:p>
+            <w:pPr>
+              <w:spacing w:after="0" w:line="248"/>
+              <w:jc w:val="center"/>
+            </w:pPr>
+            <w:r>
+              <w:rPr>
+                <w:b w:val="false"/>
+                <w:bCs w:val="false"/>
+                <w:sz w:val="15"/>
+                <w:szCs w:val="15"/>
+              </w:rPr>
+              <w:t xml:space="preserve">65.80</w:t>
+            </w:r>
+          </w:p>
+        </w:tc>
+        <w:tc>
+          <w:tcPr>
+            <w:tcW w:type="dxa" w:w="600"/>
+            <w:tcMar>
+              <w:top w:type="dxa" w:w="72"/>
+              <w:left w:type="dxa" w:w="95"/>
+              <w:bottom w:type="dxa" w:w="72"/>
+              <w:right w:type="dxa" w:w="95"/>
+            </w:tcMar>
+          </w:tcPr>
+          <w:p>
+            <w:pPr>
+              <w:spacing w:after="0" w:line="248"/>
+              <w:jc w:val="center"/>
+            </w:pPr>
+            <w:r>
+              <w:rPr>
+                <w:b w:val="false"/>
+                <w:bCs w:val="false"/>
+                <w:sz w:val="15"/>
+                <w:szCs w:val="15"/>
+              </w:rPr>
+              <w:t xml:space="preserve">67.36</w:t>
+            </w:r>
+          </w:p>
+        </w:tc>
+        <w:tc>
+          <w:tcPr>
+            <w:tcW w:type="dxa" w:w="600"/>
+            <w:tcMar>
+              <w:top w:type="dxa" w:w="72"/>
+              <w:left w:type="dxa" w:w="95"/>
+              <w:bottom w:type="dxa" w:w="72"/>
+              <w:right w:type="dxa" w:w="95"/>
+            </w:tcMar>
+          </w:tcPr>
+          <w:p>
+            <w:pPr>
+              <w:spacing w:after="0" w:line="248"/>
+              <w:jc w:val="center"/>
+            </w:pPr>
+            <w:r>
+              <w:rPr>
+                <w:b w:val="false"/>
+                <w:bCs w:val="false"/>
+                <w:sz w:val="15"/>
+                <w:szCs w:val="15"/>
+              </w:rPr>
+              <w:t xml:space="preserve">63.37</w:t>
+            </w:r>
+          </w:p>
+        </w:tc>
+        <w:tc>
+          <w:tcPr>
+            <w:tcW w:type="dxa" w:w="1500"/>
+            <w:tcMar>
+              <w:top w:type="dxa" w:w="72"/>
+              <w:left w:type="dxa" w:w="95"/>
+              <w:bottom w:type="dxa" w:w="72"/>
+              <w:right w:type="dxa" w:w="95"/>
+            </w:tcMar>
+          </w:tcPr>
+          <w:p>
+            <w:pPr>
+              <w:spacing w:after="0" w:line="248"/>
+              <w:jc w:val="center"/>
+            </w:pPr>
+            <w:r>
+              <w:rPr>
+                <w:b w:val="false"/>
+                <w:bCs w:val="false"/>
+                <w:sz w:val="15"/>
+                <w:szCs w:val="15"/>
+              </w:rPr>
+              <w:t xml:space="preserve">56.85 ± 15.82</w:t>
+            </w:r>
+          </w:p>
+        </w:tc>
+        <w:tc>
+          <w:tcPr>
+            <w:tcW w:type="dxa" w:w="1100"/>
+            <w:tcMar>
+              <w:top w:type="dxa" w:w="72"/>
+              <w:left w:type="dxa" w:w="95"/>
+              <w:bottom w:type="dxa" w:w="72"/>
+              <w:right w:type="dxa" w:w="95"/>
+            </w:tcMar>
+          </w:tcPr>
+          <w:p>
+            <w:pPr>
+              <w:spacing w:after="0" w:line="248"/>
+              <w:jc w:val="center"/>
+            </w:pPr>
+            <w:r>
+              <w:rPr>
+                <w:b w:val="false"/>
+                <w:bCs w:val="false"/>
+                <w:sz w:val="15"/>
+                <w:szCs w:val="15"/>
+              </w:rPr>
+              <w:t xml:space="preserve">0.4246</w:t>
+            </w:r>
+          </w:p>
+        </w:tc>
+      </w:tr>
+      <w:tr>
+        <w:trPr>
+          <w:cantSplit/>
+        </w:trPr>
+        <w:tc>
+          <w:tcPr>
+            <w:tcW w:type="dxa" w:w="1500"/>
+            <w:shd w:fill="EFF3F9" w:color="auto" w:val="clear"/>
+            <w:tcMar>
+              <w:top w:type="dxa" w:w="72"/>
+              <w:left w:type="dxa" w:w="95"/>
+              <w:bottom w:type="dxa" w:w="72"/>
+              <w:right w:type="dxa" w:w="95"/>
+            </w:tcMar>
+          </w:tcPr>
+          <w:p>
+            <w:pPr>
+              <w:spacing w:after="0" w:line="248"/>
+              <w:jc w:val="left"/>
+            </w:pPr>
+            <w:r>
+              <w:rPr>
+                <w:b/>
+                <w:bCs/>
+                <w:sz w:val="15"/>
+                <w:szCs w:val="15"/>
+              </w:rPr>
+              <w:t xml:space="preserve">EEG Conformer+</w:t>
+            </w:r>
+          </w:p>
+        </w:tc>
+        <w:tc>
+          <w:tcPr>
+            <w:tcW w:type="dxa" w:w="600"/>
+            <w:shd w:fill="EFF3F9" w:color="auto" w:val="clear"/>
+            <w:tcMar>
+              <w:top w:type="dxa" w:w="72"/>
+              <w:left w:type="dxa" w:w="95"/>
+              <w:bottom w:type="dxa" w:w="72"/>
+              <w:right w:type="dxa" w:w="95"/>
+            </w:tcMar>
+          </w:tcPr>
+          <w:p>
+            <w:pPr>
+              <w:spacing w:after="0" w:line="248"/>
+              <w:jc w:val="center"/>
+            </w:pPr>
+            <w:r>
+              <w:rPr>
+                <w:b w:val="false"/>
+                <w:bCs w:val="false"/>
+                <w:sz w:val="15"/>
+                <w:szCs w:val="15"/>
+              </w:rPr>
+              <w:t xml:space="preserve">68.75</w:t>
+            </w:r>
+          </w:p>
+        </w:tc>
+        <w:tc>
+          <w:tcPr>
+            <w:tcW w:type="dxa" w:w="600"/>
+            <w:shd w:fill="EFF3F9" w:color="auto" w:val="clear"/>
+            <w:tcMar>
+              <w:top w:type="dxa" w:w="72"/>
+              <w:left w:type="dxa" w:w="95"/>
+              <w:bottom w:type="dxa" w:w="72"/>
+              <w:right w:type="dxa" w:w="95"/>
+            </w:tcMar>
+          </w:tcPr>
+          <w:p>
+            <w:pPr>
+              <w:spacing w:after="0" w:line="248"/>
+              <w:jc w:val="center"/>
+            </w:pPr>
+            <w:r>
+              <w:rPr>
+                <w:b w:val="false"/>
+                <w:bCs w:val="false"/>
+                <w:sz w:val="15"/>
+                <w:szCs w:val="15"/>
+              </w:rPr>
+              <w:t xml:space="preserve">37.33</w:t>
+            </w:r>
+          </w:p>
+        </w:tc>
+        <w:tc>
+          <w:tcPr>
+            <w:tcW w:type="dxa" w:w="600"/>
+            <w:shd w:fill="EFF3F9" w:color="auto" w:val="clear"/>
+            <w:tcMar>
+              <w:top w:type="dxa" w:w="72"/>
+              <w:left w:type="dxa" w:w="95"/>
+              <w:bottom w:type="dxa" w:w="72"/>
+              <w:right w:type="dxa" w:w="95"/>
+            </w:tcMar>
+          </w:tcPr>
+          <w:p>
+            <w:pPr>
+              <w:spacing w:after="0" w:line="248"/>
+              <w:jc w:val="center"/>
+            </w:pPr>
+            <w:r>
+              <w:rPr>
+                <w:b w:val="false"/>
+                <w:bCs w:val="false"/>
+                <w:sz w:val="15"/>
+                <w:szCs w:val="15"/>
+              </w:rPr>
+              <w:t xml:space="preserve">69.62</w:t>
+            </w:r>
+          </w:p>
+        </w:tc>
+        <w:tc>
+          <w:tcPr>
+            <w:tcW w:type="dxa" w:w="600"/>
+            <w:shd w:fill="EFF3F9" w:color="auto" w:val="clear"/>
+            <w:tcMar>
+              <w:top w:type="dxa" w:w="72"/>
+              <w:left w:type="dxa" w:w="95"/>
+              <w:bottom w:type="dxa" w:w="72"/>
+              <w:right w:type="dxa" w:w="95"/>
+            </w:tcMar>
+          </w:tcPr>
+          <w:p>
+            <w:pPr>
+              <w:spacing w:after="0" w:line="248"/>
+              <w:jc w:val="center"/>
+            </w:pPr>
+            <w:r>
+              <w:rPr>
+                <w:b w:val="false"/>
+                <w:bCs w:val="false"/>
+                <w:sz w:val="15"/>
+                <w:szCs w:val="15"/>
+              </w:rPr>
+              <w:t xml:space="preserve">43.58</w:t>
+            </w:r>
+          </w:p>
+        </w:tc>
+        <w:tc>
+          <w:tcPr>
+            <w:tcW w:type="dxa" w:w="600"/>
+            <w:shd w:fill="EFF3F9" w:color="auto" w:val="clear"/>
+            <w:tcMar>
+              <w:top w:type="dxa" w:w="72"/>
+              <w:left w:type="dxa" w:w="95"/>
+              <w:bottom w:type="dxa" w:w="72"/>
+              <w:right w:type="dxa" w:w="95"/>
+            </w:tcMar>
+          </w:tcPr>
+          <w:p>
+            <w:pPr>
+              <w:spacing w:after="0" w:line="248"/>
+              <w:jc w:val="center"/>
+            </w:pPr>
+            <w:r>
+              <w:rPr>
+                <w:b w:val="false"/>
+                <w:bCs w:val="false"/>
+                <w:sz w:val="15"/>
+                <w:szCs w:val="15"/>
+              </w:rPr>
+              <w:t xml:space="preserve">29.51</w:t>
+            </w:r>
+          </w:p>
+        </w:tc>
+        <w:tc>
+          <w:tcPr>
+            <w:tcW w:type="dxa" w:w="600"/>
+            <w:shd w:fill="EFF3F9" w:color="auto" w:val="clear"/>
+            <w:tcMar>
+              <w:top w:type="dxa" w:w="72"/>
+              <w:left w:type="dxa" w:w="95"/>
+              <w:bottom w:type="dxa" w:w="72"/>
+              <w:right w:type="dxa" w:w="95"/>
+            </w:tcMar>
+          </w:tcPr>
+          <w:p>
+            <w:pPr>
+              <w:spacing w:after="0" w:line="248"/>
+              <w:jc w:val="center"/>
+            </w:pPr>
+            <w:r>
+              <w:rPr>
+                <w:b w:val="false"/>
+                <w:bCs w:val="false"/>
+                <w:sz w:val="15"/>
+                <w:szCs w:val="15"/>
+              </w:rPr>
+              <w:t xml:space="preserve">35.24</w:t>
+            </w:r>
+          </w:p>
+        </w:tc>
+        <w:tc>
+          <w:tcPr>
+            <w:tcW w:type="dxa" w:w="600"/>
+            <w:shd w:fill="EFF3F9" w:color="auto" w:val="clear"/>
+            <w:tcMar>
+              <w:top w:type="dxa" w:w="72"/>
+              <w:left w:type="dxa" w:w="95"/>
+              <w:bottom w:type="dxa" w:w="72"/>
+              <w:right w:type="dxa" w:w="95"/>
+            </w:tcMar>
+          </w:tcPr>
+          <w:p>
+            <w:pPr>
+              <w:spacing w:after="0" w:line="248"/>
+              <w:jc w:val="center"/>
+            </w:pPr>
+            <w:r>
+              <w:rPr>
+                <w:b w:val="false"/>
+                <w:bCs w:val="false"/>
+                <w:sz w:val="15"/>
+                <w:szCs w:val="15"/>
+              </w:rPr>
+              <w:t xml:space="preserve">58.33</w:t>
+            </w:r>
+          </w:p>
+        </w:tc>
+        <w:tc>
+          <w:tcPr>
+            <w:tcW w:type="dxa" w:w="600"/>
+            <w:shd w:fill="EFF3F9" w:color="auto" w:val="clear"/>
+            <w:tcMar>
+              <w:top w:type="dxa" w:w="72"/>
+              <w:left w:type="dxa" w:w="95"/>
+              <w:bottom w:type="dxa" w:w="72"/>
+              <w:right w:type="dxa" w:w="95"/>
+            </w:tcMar>
+          </w:tcPr>
+          <w:p>
+            <w:pPr>
+              <w:spacing w:after="0" w:line="248"/>
+              <w:jc w:val="center"/>
+            </w:pPr>
+            <w:r>
+              <w:rPr>
+                <w:b w:val="false"/>
+                <w:bCs w:val="false"/>
+                <w:sz w:val="15"/>
+                <w:szCs w:val="15"/>
+              </w:rPr>
+              <w:t xml:space="preserve">74.48</w:t>
+            </w:r>
+          </w:p>
+        </w:tc>
+        <w:tc>
+          <w:tcPr>
+            <w:tcW w:type="dxa" w:w="600"/>
+            <w:shd w:fill="EFF3F9" w:color="auto" w:val="clear"/>
+            <w:tcMar>
+              <w:top w:type="dxa" w:w="72"/>
+              <w:left w:type="dxa" w:w="95"/>
+              <w:bottom w:type="dxa" w:w="72"/>
+              <w:right w:type="dxa" w:w="95"/>
+            </w:tcMar>
+          </w:tcPr>
+          <w:p>
+            <w:pPr>
+              <w:spacing w:after="0" w:line="248"/>
+              <w:jc w:val="center"/>
+            </w:pPr>
+            <w:r>
+              <w:rPr>
+                <w:b w:val="false"/>
+                <w:bCs w:val="false"/>
+                <w:sz w:val="15"/>
+                <w:szCs w:val="15"/>
+              </w:rPr>
+              <w:t xml:space="preserve">63.89</w:t>
+            </w:r>
+          </w:p>
+        </w:tc>
+        <w:tc>
+          <w:tcPr>
+            <w:tcW w:type="dxa" w:w="1500"/>
+            <w:shd w:fill="EFF3F9" w:color="auto" w:val="clear"/>
+            <w:tcMar>
+              <w:top w:type="dxa" w:w="72"/>
+              <w:left w:type="dxa" w:w="95"/>
+              <w:bottom w:type="dxa" w:w="72"/>
+              <w:right w:type="dxa" w:w="95"/>
+            </w:tcMar>
+          </w:tcPr>
+          <w:p>
+            <w:pPr>
+              <w:spacing w:after="0" w:line="248"/>
+              <w:jc w:val="center"/>
+            </w:pPr>
+            <w:r>
+              <w:rPr>
+                <w:b w:val="false"/>
+                <w:bCs w:val="false"/>
+                <w:sz w:val="15"/>
+                <w:szCs w:val="15"/>
+              </w:rPr>
+              <w:t xml:space="preserve">53.41 ± 17.08</w:t>
+            </w:r>
+          </w:p>
+        </w:tc>
+        <w:tc>
+          <w:tcPr>
+            <w:tcW w:type="dxa" w:w="1100"/>
+            <w:shd w:fill="EFF3F9" w:color="auto" w:val="clear"/>
+            <w:tcMar>
+              <w:top w:type="dxa" w:w="72"/>
+              <w:left w:type="dxa" w:w="95"/>
+              <w:bottom w:type="dxa" w:w="72"/>
+              <w:right w:type="dxa" w:w="95"/>
+            </w:tcMar>
+          </w:tcPr>
+          <w:p>
+            <w:pPr>
+              <w:spacing w:after="0" w:line="248"/>
+              <w:jc w:val="center"/>
+            </w:pPr>
+            <w:r>
+              <w:rPr>
+                <w:b w:val="false"/>
+                <w:bCs w:val="false"/>
+                <w:sz w:val="15"/>
+                <w:szCs w:val="15"/>
+              </w:rPr>
+              <w:t xml:space="preserve">0.3789</w:t>
+            </w:r>
+          </w:p>
+        </w:tc>
+      </w:tr>
+      <w:tr>
+        <w:trPr>
+          <w:cantSplit/>
+        </w:trPr>
+        <w:tc>
+          <w:tcPr>
+            <w:tcW w:type="dxa" w:w="1500"/>
+            <w:tcMar>
+              <w:top w:type="dxa" w:w="72"/>
+              <w:left w:type="dxa" w:w="95"/>
+              <w:bottom w:type="dxa" w:w="72"/>
+              <w:right w:type="dxa" w:w="95"/>
+            </w:tcMar>
+          </w:tcPr>
+          <w:p>
+            <w:pPr>
+              <w:spacing w:after="0" w:line="248"/>
+              <w:jc w:val="left"/>
+            </w:pPr>
+            <w:r>
+              <w:rPr>
+                <w:b/>
+                <w:bCs/>
+                <w:sz w:val="15"/>
+                <w:szCs w:val="15"/>
+              </w:rPr>
+              <w:t xml:space="preserve">CTNet</w:t>
+            </w:r>
+          </w:p>
+        </w:tc>
+        <w:tc>
+          <w:tcPr>
+            <w:tcW w:type="dxa" w:w="600"/>
+            <w:tcMar>
+              <w:top w:type="dxa" w:w="72"/>
+              <w:left w:type="dxa" w:w="95"/>
+              <w:bottom w:type="dxa" w:w="72"/>
+              <w:right w:type="dxa" w:w="95"/>
+            </w:tcMar>
+          </w:tcPr>
+          <w:p>
+            <w:pPr>
+              <w:spacing w:after="0" w:line="248"/>
+              <w:jc w:val="center"/>
+            </w:pPr>
+            <w:r>
+              <w:rPr>
+                <w:b w:val="false"/>
+                <w:bCs w:val="false"/>
+                <w:sz w:val="15"/>
+                <w:szCs w:val="15"/>
+              </w:rPr>
+              <w:t xml:space="preserve">69.27</w:t>
+            </w:r>
+          </w:p>
+        </w:tc>
+        <w:tc>
+          <w:tcPr>
+            <w:tcW w:type="dxa" w:w="600"/>
+            <w:tcMar>
+              <w:top w:type="dxa" w:w="72"/>
+              <w:left w:type="dxa" w:w="95"/>
+              <w:bottom w:type="dxa" w:w="72"/>
+              <w:right w:type="dxa" w:w="95"/>
+            </w:tcMar>
+          </w:tcPr>
+          <w:p>
+            <w:pPr>
+              <w:spacing w:after="0" w:line="248"/>
+              <w:jc w:val="center"/>
+            </w:pPr>
+            <w:r>
+              <w:rPr>
+                <w:b w:val="false"/>
+                <w:bCs w:val="false"/>
+                <w:sz w:val="15"/>
+                <w:szCs w:val="15"/>
+              </w:rPr>
+              <w:t xml:space="preserve">43.92</w:t>
+            </w:r>
+          </w:p>
+        </w:tc>
+        <w:tc>
+          <w:tcPr>
+            <w:tcW w:type="dxa" w:w="600"/>
+            <w:tcMar>
+              <w:top w:type="dxa" w:w="72"/>
+              <w:left w:type="dxa" w:w="95"/>
+              <w:bottom w:type="dxa" w:w="72"/>
+              <w:right w:type="dxa" w:w="95"/>
+            </w:tcMar>
+          </w:tcPr>
+          <w:p>
+            <w:pPr>
+              <w:spacing w:after="0" w:line="248"/>
+              <w:jc w:val="center"/>
+            </w:pPr>
+            <w:r>
+              <w:rPr>
+                <w:b w:val="false"/>
+                <w:bCs w:val="false"/>
+                <w:sz w:val="15"/>
+                <w:szCs w:val="15"/>
+              </w:rPr>
+              <w:t xml:space="preserve">79.34</w:t>
+            </w:r>
+          </w:p>
+        </w:tc>
+        <w:tc>
+          <w:tcPr>
+            <w:tcW w:type="dxa" w:w="600"/>
+            <w:tcMar>
+              <w:top w:type="dxa" w:w="72"/>
+              <w:left w:type="dxa" w:w="95"/>
+              <w:bottom w:type="dxa" w:w="72"/>
+              <w:right w:type="dxa" w:w="95"/>
+            </w:tcMar>
+          </w:tcPr>
+          <w:p>
+            <w:pPr>
+              <w:spacing w:after="0" w:line="248"/>
+              <w:jc w:val="center"/>
+            </w:pPr>
+            <w:r>
+              <w:rPr>
+                <w:b w:val="false"/>
+                <w:bCs w:val="false"/>
+                <w:sz w:val="15"/>
+                <w:szCs w:val="15"/>
+              </w:rPr>
+              <w:t xml:space="preserve">55.38</w:t>
+            </w:r>
+          </w:p>
+        </w:tc>
+        <w:tc>
+          <w:tcPr>
+            <w:tcW w:type="dxa" w:w="600"/>
+            <w:tcMar>
+              <w:top w:type="dxa" w:w="72"/>
+              <w:left w:type="dxa" w:w="95"/>
+              <w:bottom w:type="dxa" w:w="72"/>
+              <w:right w:type="dxa" w:w="95"/>
+            </w:tcMar>
+          </w:tcPr>
+          <w:p>
+            <w:pPr>
+              <w:spacing w:after="0" w:line="248"/>
+              <w:jc w:val="center"/>
+            </w:pPr>
+            <w:r>
+              <w:rPr>
+                <w:b w:val="false"/>
+                <w:bCs w:val="false"/>
+                <w:sz w:val="15"/>
+                <w:szCs w:val="15"/>
+              </w:rPr>
+              <w:t xml:space="preserve">43.92</w:t>
+            </w:r>
+          </w:p>
+        </w:tc>
+        <w:tc>
+          <w:tcPr>
+            <w:tcW w:type="dxa" w:w="600"/>
+            <w:tcMar>
+              <w:top w:type="dxa" w:w="72"/>
+              <w:left w:type="dxa" w:w="95"/>
+              <w:bottom w:type="dxa" w:w="72"/>
+              <w:right w:type="dxa" w:w="95"/>
+            </w:tcMar>
+          </w:tcPr>
+          <w:p>
+            <w:pPr>
+              <w:spacing w:after="0" w:line="248"/>
+              <w:jc w:val="center"/>
+            </w:pPr>
+            <w:r>
+              <w:rPr>
+                <w:b w:val="false"/>
+                <w:bCs w:val="false"/>
+                <w:sz w:val="15"/>
+                <w:szCs w:val="15"/>
+              </w:rPr>
+              <w:t xml:space="preserve">36.11</w:t>
+            </w:r>
+          </w:p>
+        </w:tc>
+        <w:tc>
+          <w:tcPr>
+            <w:tcW w:type="dxa" w:w="600"/>
+            <w:tcMar>
+              <w:top w:type="dxa" w:w="72"/>
+              <w:left w:type="dxa" w:w="95"/>
+              <w:bottom w:type="dxa" w:w="72"/>
+              <w:right w:type="dxa" w:w="95"/>
+            </w:tcMar>
+          </w:tcPr>
+          <w:p>
+            <w:pPr>
+              <w:spacing w:after="0" w:line="248"/>
+              <w:jc w:val="center"/>
+            </w:pPr>
+            <w:r>
+              <w:rPr>
+                <w:b w:val="false"/>
+                <w:bCs w:val="false"/>
+                <w:sz w:val="15"/>
+                <w:szCs w:val="15"/>
+              </w:rPr>
+              <w:t xml:space="preserve">65.10</w:t>
+            </w:r>
+          </w:p>
+        </w:tc>
+        <w:tc>
+          <w:tcPr>
+            <w:tcW w:type="dxa" w:w="600"/>
+            <w:tcMar>
+              <w:top w:type="dxa" w:w="72"/>
+              <w:left w:type="dxa" w:w="95"/>
+              <w:bottom w:type="dxa" w:w="72"/>
+              <w:right w:type="dxa" w:w="95"/>
+            </w:tcMar>
+          </w:tcPr>
+          <w:p>
+            <w:pPr>
+              <w:spacing w:after="0" w:line="248"/>
+              <w:jc w:val="center"/>
+            </w:pPr>
+            <w:r>
+              <w:rPr>
+                <w:b w:val="false"/>
+                <w:bCs w:val="false"/>
+                <w:sz w:val="15"/>
+                <w:szCs w:val="15"/>
+              </w:rPr>
+              <w:t xml:space="preserve">70.66</w:t>
+            </w:r>
+          </w:p>
+        </w:tc>
+        <w:tc>
+          <w:tcPr>
+            <w:tcW w:type="dxa" w:w="600"/>
+            <w:tcMar>
+              <w:top w:type="dxa" w:w="72"/>
+              <w:left w:type="dxa" w:w="95"/>
+              <w:bottom w:type="dxa" w:w="72"/>
+              <w:right w:type="dxa" w:w="95"/>
+            </w:tcMar>
+          </w:tcPr>
+          <w:p>
+            <w:pPr>
+              <w:spacing w:after="0" w:line="248"/>
+              <w:jc w:val="center"/>
+            </w:pPr>
+            <w:r>
+              <w:rPr>
+                <w:b w:val="false"/>
+                <w:bCs w:val="false"/>
+                <w:sz w:val="15"/>
+                <w:szCs w:val="15"/>
+              </w:rPr>
+              <w:t xml:space="preserve">64.06</w:t>
+            </w:r>
+          </w:p>
+        </w:tc>
+        <w:tc>
+          <w:tcPr>
+            <w:tcW w:type="dxa" w:w="1500"/>
+            <w:tcMar>
+              <w:top w:type="dxa" w:w="72"/>
+              <w:left w:type="dxa" w:w="95"/>
+              <w:bottom w:type="dxa" w:w="72"/>
+              <w:right w:type="dxa" w:w="95"/>
+            </w:tcMar>
+          </w:tcPr>
+          <w:p>
+            <w:pPr>
+              <w:spacing w:after="0" w:line="248"/>
+              <w:jc w:val="center"/>
+            </w:pPr>
+            <w:r>
+              <w:rPr>
+                <w:b w:val="false"/>
+                <w:bCs w:val="false"/>
+                <w:sz w:val="15"/>
+                <w:szCs w:val="15"/>
+              </w:rPr>
+              <w:t xml:space="preserve">58.64 ± 14.61</w:t>
+            </w:r>
+          </w:p>
+        </w:tc>
+        <w:tc>
+          <w:tcPr>
+            <w:tcW w:type="dxa" w:w="1100"/>
+            <w:tcMar>
+              <w:top w:type="dxa" w:w="72"/>
+              <w:left w:type="dxa" w:w="95"/>
+              <w:bottom w:type="dxa" w:w="72"/>
+              <w:right w:type="dxa" w:w="95"/>
+            </w:tcMar>
+          </w:tcPr>
+          <w:p>
+            <w:pPr>
+              <w:spacing w:after="0" w:line="248"/>
+              <w:jc w:val="center"/>
+            </w:pPr>
+            <w:r>
+              <w:rPr>
+                <w:b w:val="false"/>
+                <w:bCs w:val="false"/>
+                <w:sz w:val="15"/>
+                <w:szCs w:val="15"/>
+              </w:rPr>
+              <w:t xml:space="preserve">0.4486</w:t>
+            </w:r>
+          </w:p>
+        </w:tc>
+      </w:tr>
+    </w:tbl>
+    <w:p>
+      <w:pPr>
+        <w:spacing w:after="190" w:before="70"/>
+      </w:pPr>
+      <w:r>
+        <w:rPr>
+          <w:i/>
+          <w:iCs/>
+          <w:color w:val="5A6478"/>
+          <w:sz w:val="17"/>
+          <w:szCs w:val="17"/>
+        </w:rPr>
+        <w:t xml:space="preserve">Table 15.2 — Cross-subject reference: leave-one-subject-out accuracy (%) on BCI IV-2a as reported by Zhao et al. (2024), the CTNet paper. Each subject is held out in turn and the model is trained on the data of the other eight, for 600 epochs with batch size 512 and learning rate 0.001, on the 2–6 s window (1,000 samples) with z-score normalisation and no alignment; the held-out subject is used only for testing, with no fine-tuning. Models marked + were re-implemented by the CTNet authors under the same conditions. This is the only published comparison of these architectures under one cross-subject protocol that could be verified, and it is the reference for this project's cross-subject results.</w:t>
+      </w:r>
+    </w:p>
+    <w:p>
+      <w:pPr>
+        <w:spacing w:after="40"/>
+      </w:pPr>
+      <w:r>
+        <w:rPr>
+          <w:sz w:val="10"/>
+          <w:szCs w:val="10"/>
+        </w:rPr>
+        <w:t xml:space="preserve"/>
+      </w:r>
+    </w:p>
+    <w:tbl>
+      <w:tblPr>
+        <w:tblW w:type="dxa" w:w="9500"/>
+        <w:tblBorders>
+          <w:top w:val="single" w:color="auto" w:sz="4"/>
+          <w:left w:val="single" w:color="auto" w:sz="4"/>
+          <w:bottom w:val="single" w:color="auto" w:sz="4"/>
+          <w:right w:val="single" w:color="auto" w:sz="4"/>
+          <w:insideH w:val="single" w:color="auto" w:sz="4"/>
+          <w:insideV w:val="single" w:color="auto" w:sz="4"/>
+        </w:tblBorders>
+      </w:tblPr>
+      <w:tblGrid>
+        <w:gridCol w:w="1700"/>
+        <w:gridCol w:w="1300"/>
+        <w:gridCol w:w="2700"/>
+        <w:gridCol w:w="3800"/>
+      </w:tblGrid>
+      <w:tr>
+        <w:trPr>
+          <w:cantSplit/>
+          <w:tblHeader/>
+        </w:trPr>
+        <w:tc>
+          <w:tcPr>
+            <w:tcW w:type="dxa" w:w="1700"/>
+            <w:shd w:fill="1B3A6B" w:color="auto" w:val="clear"/>
+            <w:tcMar>
+              <w:top w:type="dxa" w:w="72"/>
+              <w:left w:type="dxa" w:w="95"/>
+              <w:bottom w:type="dxa" w:w="72"/>
+              <w:right w:type="dxa" w:w="95"/>
+            </w:tcMar>
+          </w:tcPr>
+          <w:p>
+            <w:pPr>
+              <w:spacing w:after="0" w:line="248"/>
+              <w:jc w:val="left"/>
+            </w:pPr>
+            <w:r>
+              <w:rPr>
+                <w:b/>
+                <w:bCs/>
+                <w:color w:val="FFFFFF"/>
+                <w:sz w:val="18"/>
+                <w:szCs w:val="18"/>
+              </w:rPr>
+              <w:t xml:space="preserve">Model</w:t>
+            </w:r>
+          </w:p>
+        </w:tc>
+        <w:tc>
+          <w:tcPr>
+            <w:tcW w:type="dxa" w:w="1300"/>
+            <w:shd w:fill="1B3A6B" w:color="auto" w:val="clear"/>
+            <w:tcMar>
+              <w:top w:type="dxa" w:w="72"/>
+              <w:left w:type="dxa" w:w="95"/>
+              <w:bottom w:type="dxa" w:w="72"/>
+              <w:right w:type="dxa" w:w="95"/>
+            </w:tcMar>
+          </w:tcPr>
+          <w:p>
+            <w:pPr>
+              <w:spacing w:after="0" w:line="248"/>
+              <w:jc w:val="center"/>
+            </w:pPr>
+            <w:r>
+              <w:rPr>
+                <w:b/>
+                <w:bCs/>
+                <w:color w:val="FFFFFF"/>
+                <w:sz w:val="18"/>
+                <w:szCs w:val="18"/>
+              </w:rPr>
+              <w:t xml:space="preserve">Accuracy</w:t>
+            </w:r>
+          </w:p>
+        </w:tc>
+        <w:tc>
+          <w:tcPr>
+            <w:tcW w:type="dxa" w:w="2700"/>
+            <w:shd w:fill="1B3A6B" w:color="auto" w:val="clear"/>
+            <w:tcMar>
+              <w:top w:type="dxa" w:w="72"/>
+              <w:left w:type="dxa" w:w="95"/>
+              <w:bottom w:type="dxa" w:w="72"/>
+              <w:right w:type="dxa" w:w="95"/>
+            </w:tcMar>
+          </w:tcPr>
+          <w:p>
+            <w:pPr>
+              <w:spacing w:after="0" w:line="248"/>
+              <w:jc w:val="left"/>
+            </w:pPr>
+            <w:r>
+              <w:rPr>
+                <w:b/>
+                <w:bCs/>
+                <w:color w:val="FFFFFF"/>
+                <w:sz w:val="18"/>
+                <w:szCs w:val="18"/>
+              </w:rPr>
+              <w:t xml:space="preserve">Source</w:t>
+            </w:r>
+          </w:p>
+        </w:tc>
+        <w:tc>
+          <w:tcPr>
+            <w:tcW w:type="dxa" w:w="3800"/>
+            <w:shd w:fill="1B3A6B" w:color="auto" w:val="clear"/>
+            <w:tcMar>
+              <w:top w:type="dxa" w:w="72"/>
+              <w:left w:type="dxa" w:w="95"/>
+              <w:bottom w:type="dxa" w:w="72"/>
+              <w:right w:type="dxa" w:w="95"/>
+            </w:tcMar>
+          </w:tcPr>
+          <w:p>
+            <w:pPr>
+              <w:spacing w:after="0" w:line="248"/>
+              <w:jc w:val="left"/>
+            </w:pPr>
+            <w:r>
+              <w:rPr>
+                <w:b/>
+                <w:bCs/>
+                <w:color w:val="FFFFFF"/>
+                <w:sz w:val="18"/>
+                <w:szCs w:val="18"/>
+              </w:rPr>
+              <w:t xml:space="preserve">Evaluation behind the figure</w:t>
+            </w:r>
+          </w:p>
+        </w:tc>
+      </w:tr>
+      <w:tr>
+        <w:trPr>
+          <w:cantSplit/>
+        </w:trPr>
+        <w:tc>
+          <w:tcPr>
+            <w:tcW w:type="dxa" w:w="1700"/>
+            <w:tcMar>
+              <w:top w:type="dxa" w:w="72"/>
+              <w:left w:type="dxa" w:w="95"/>
+              <w:bottom w:type="dxa" w:w="72"/>
+              <w:right w:type="dxa" w:w="95"/>
+            </w:tcMar>
+          </w:tcPr>
+          <w:p>
+            <w:pPr>
+              <w:spacing w:after="0" w:line="248"/>
+              <w:jc w:val="left"/>
+            </w:pPr>
+            <w:r>
+              <w:rPr>
+                <w:b/>
+                <w:bCs/>
+                <w:sz w:val="16"/>
+                <w:szCs w:val="16"/>
+              </w:rPr>
+              <w:t xml:space="preserve">CTNet</w:t>
+            </w:r>
+          </w:p>
+        </w:tc>
+        <w:tc>
+          <w:tcPr>
+            <w:tcW w:type="dxa" w:w="1300"/>
+            <w:tcMar>
+              <w:top w:type="dxa" w:w="72"/>
+              <w:left w:type="dxa" w:w="95"/>
+              <w:bottom w:type="dxa" w:w="72"/>
+              <w:right w:type="dxa" w:w="95"/>
+            </w:tcMar>
+          </w:tcPr>
+          <w:p>
+            <w:pPr>
+              <w:spacing w:after="0" w:line="248"/>
+              <w:jc w:val="center"/>
+            </w:pPr>
+            <w:r>
+              <w:rPr>
+                <w:b w:val="false"/>
+                <w:bCs w:val="false"/>
+                <w:sz w:val="16"/>
+                <w:szCs w:val="16"/>
+              </w:rPr>
+              <w:t xml:space="preserve">82.52%</w:t>
+            </w:r>
+          </w:p>
+        </w:tc>
+        <w:tc>
+          <w:tcPr>
+            <w:tcW w:type="dxa" w:w="2700"/>
+            <w:tcMar>
+              <w:top w:type="dxa" w:w="72"/>
+              <w:left w:type="dxa" w:w="95"/>
+              <w:bottom w:type="dxa" w:w="72"/>
+              <w:right w:type="dxa" w:w="95"/>
+            </w:tcMar>
+          </w:tcPr>
+          <w:p>
+            <w:pPr>
+              <w:spacing w:after="0" w:line="248"/>
+              <w:jc w:val="left"/>
+            </w:pPr>
+            <w:r>
+              <w:rPr>
+                <w:b w:val="false"/>
+                <w:bCs w:val="false"/>
+                <w:sz w:val="16"/>
+                <w:szCs w:val="16"/>
+              </w:rPr>
+              <w:t xml:space="preserve">Zhao et al. (2024)</w:t>
+            </w:r>
+          </w:p>
+        </w:tc>
+        <w:tc>
+          <w:tcPr>
+            <w:tcW w:type="dxa" w:w="3800"/>
+            <w:tcMar>
+              <w:top w:type="dxa" w:w="72"/>
+              <w:left w:type="dxa" w:w="95"/>
+              <w:bottom w:type="dxa" w:w="72"/>
+              <w:right w:type="dxa" w:w="95"/>
+            </w:tcMar>
+          </w:tcPr>
+          <w:p>
+            <w:pPr>
+              <w:spacing w:after="0" w:line="248"/>
+              <w:jc w:val="left"/>
+            </w:pPr>
+            <w:r>
+              <w:rPr>
+                <w:b w:val="false"/>
+                <w:bCs w:val="false"/>
+                <w:sz w:val="16"/>
+                <w:szCs w:val="16"/>
+              </w:rPr>
+              <w:t xml:space="preserve">Session 1 trains, session 2 tests; 30% of the training data held out for validation; 1,000 epochs</w:t>
+            </w:r>
+          </w:p>
+        </w:tc>
+      </w:tr>
+      <w:tr>
+        <w:trPr>
+          <w:cantSplit/>
+        </w:trPr>
+        <w:tc>
+          <w:tcPr>
+            <w:tcW w:type="dxa" w:w="1700"/>
+            <w:shd w:fill="EFF3F9" w:color="auto" w:val="clear"/>
+            <w:tcMar>
+              <w:top w:type="dxa" w:w="72"/>
+              <w:left w:type="dxa" w:w="95"/>
+              <w:bottom w:type="dxa" w:w="72"/>
+              <w:right w:type="dxa" w:w="95"/>
+            </w:tcMar>
+          </w:tcPr>
+          <w:p>
+            <w:pPr>
+              <w:spacing w:after="0" w:line="248"/>
+              <w:jc w:val="left"/>
+            </w:pPr>
+            <w:r>
+              <w:rPr>
+                <w:b/>
+                <w:bCs/>
+                <w:sz w:val="16"/>
+                <w:szCs w:val="16"/>
+              </w:rPr>
+              <w:t xml:space="preserve">EEG Conformer</w:t>
+            </w:r>
+          </w:p>
+        </w:tc>
+        <w:tc>
+          <w:tcPr>
+            <w:tcW w:type="dxa" w:w="1300"/>
+            <w:shd w:fill="EFF3F9" w:color="auto" w:val="clear"/>
+            <w:tcMar>
+              <w:top w:type="dxa" w:w="72"/>
+              <w:left w:type="dxa" w:w="95"/>
+              <w:bottom w:type="dxa" w:w="72"/>
+              <w:right w:type="dxa" w:w="95"/>
+            </w:tcMar>
+          </w:tcPr>
+          <w:p>
+            <w:pPr>
+              <w:spacing w:after="0" w:line="248"/>
+              <w:jc w:val="center"/>
+            </w:pPr>
+            <w:r>
+              <w:rPr>
+                <w:b w:val="false"/>
+                <w:bCs w:val="false"/>
+                <w:sz w:val="16"/>
+                <w:szCs w:val="16"/>
+              </w:rPr>
+              <w:t xml:space="preserve">78.66%</w:t>
+            </w:r>
+          </w:p>
+        </w:tc>
+        <w:tc>
+          <w:tcPr>
+            <w:tcW w:type="dxa" w:w="2700"/>
+            <w:shd w:fill="EFF3F9" w:color="auto" w:val="clear"/>
+            <w:tcMar>
+              <w:top w:type="dxa" w:w="72"/>
+              <w:left w:type="dxa" w:w="95"/>
+              <w:bottom w:type="dxa" w:w="72"/>
+              <w:right w:type="dxa" w:w="95"/>
+            </w:tcMar>
+          </w:tcPr>
+          <w:p>
+            <w:pPr>
+              <w:spacing w:after="0" w:line="248"/>
+              <w:jc w:val="left"/>
+            </w:pPr>
+            <w:r>
+              <w:rPr>
+                <w:b w:val="false"/>
+                <w:bCs w:val="false"/>
+                <w:sz w:val="16"/>
+                <w:szCs w:val="16"/>
+              </w:rPr>
+              <w:t xml:space="preserve">Song et al. (2023), authors' code repository</w:t>
+            </w:r>
+          </w:p>
+        </w:tc>
+        <w:tc>
+          <w:tcPr>
+            <w:tcW w:type="dxa" w:w="3800"/>
+            <w:shd w:fill="EFF3F9" w:color="auto" w:val="clear"/>
+            <w:tcMar>
+              <w:top w:type="dxa" w:w="72"/>
+              <w:left w:type="dxa" w:w="95"/>
+              <w:bottom w:type="dxa" w:w="72"/>
+              <w:right w:type="dxa" w:w="95"/>
+            </w:tcMar>
+          </w:tcPr>
+          <w:p>
+            <w:pPr>
+              <w:spacing w:after="0" w:line="248"/>
+              <w:jc w:val="left"/>
+            </w:pPr>
+            <w:r>
+              <w:rPr>
+                <w:b w:val="false"/>
+                <w:bCs w:val="false"/>
+                <w:sz w:val="16"/>
+                <w:szCs w:val="16"/>
+              </w:rPr>
+              <w:t xml:space="preserve">Hold-out, as stated in the repository</w:t>
+            </w:r>
+          </w:p>
+        </w:tc>
+      </w:tr>
+      <w:tr>
+        <w:trPr>
+          <w:cantSplit/>
+        </w:trPr>
+        <w:tc>
+          <w:tcPr>
+            <w:tcW w:type="dxa" w:w="1700"/>
+            <w:tcMar>
+              <w:top w:type="dxa" w:w="72"/>
+              <w:left w:type="dxa" w:w="95"/>
+              <w:bottom w:type="dxa" w:w="72"/>
+              <w:right w:type="dxa" w:w="95"/>
+            </w:tcMar>
+          </w:tcPr>
+          <w:p>
+            <w:pPr>
+              <w:spacing w:after="0" w:line="248"/>
+              <w:jc w:val="left"/>
+            </w:pPr>
+            <w:r>
+              <w:rPr>
+                <w:b/>
+                <w:bCs/>
+                <w:sz w:val="16"/>
+                <w:szCs w:val="16"/>
+              </w:rPr>
+              <w:t xml:space="preserve">ATCNet</w:t>
+            </w:r>
+          </w:p>
+        </w:tc>
+        <w:tc>
+          <w:tcPr>
+            <w:tcW w:type="dxa" w:w="1300"/>
+            <w:tcMar>
+              <w:top w:type="dxa" w:w="72"/>
+              <w:left w:type="dxa" w:w="95"/>
+              <w:bottom w:type="dxa" w:w="72"/>
+              <w:right w:type="dxa" w:w="95"/>
+            </w:tcMar>
+          </w:tcPr>
+          <w:p>
+            <w:pPr>
+              <w:spacing w:after="0" w:line="248"/>
+              <w:jc w:val="center"/>
+            </w:pPr>
+            <w:r>
+              <w:rPr>
+                <w:b w:val="false"/>
+                <w:bCs w:val="false"/>
+                <w:sz w:val="16"/>
+                <w:szCs w:val="16"/>
+              </w:rPr>
+              <w:t xml:space="preserve">85.38%</w:t>
+            </w:r>
+          </w:p>
+        </w:tc>
+        <w:tc>
+          <w:tcPr>
+            <w:tcW w:type="dxa" w:w="2700"/>
+            <w:tcMar>
+              <w:top w:type="dxa" w:w="72"/>
+              <w:left w:type="dxa" w:w="95"/>
+              <w:bottom w:type="dxa" w:w="72"/>
+              <w:right w:type="dxa" w:w="95"/>
+            </w:tcMar>
+          </w:tcPr>
+          <w:p>
+            <w:pPr>
+              <w:spacing w:after="0" w:line="248"/>
+              <w:jc w:val="left"/>
+            </w:pPr>
+            <w:r>
+              <w:rPr>
+                <w:b w:val="false"/>
+                <w:bCs w:val="false"/>
+                <w:sz w:val="16"/>
+                <w:szCs w:val="16"/>
+              </w:rPr>
+              <w:t xml:space="preserve">Altaheri et al. (2023), paper</w:t>
+            </w:r>
+          </w:p>
+        </w:tc>
+        <w:tc>
+          <w:tcPr>
+            <w:tcW w:type="dxa" w:w="3800"/>
+            <w:tcMar>
+              <w:top w:type="dxa" w:w="72"/>
+              <w:left w:type="dxa" w:w="95"/>
+              <w:bottom w:type="dxa" w:w="72"/>
+              <w:right w:type="dxa" w:w="95"/>
+            </w:tcMar>
+          </w:tcPr>
+          <w:p>
+            <w:pPr>
+              <w:spacing w:after="0" w:line="248"/>
+              <w:jc w:val="left"/>
+            </w:pPr>
+            <w:r>
+              <w:rPr>
+                <w:b w:val="false"/>
+                <w:bCs w:val="false"/>
+                <w:sz w:val="16"/>
+                <w:szCs w:val="16"/>
+              </w:rPr>
+              <w:t xml:space="preserve">Subject-dependent, as stated in the paper's abstract</w:t>
+            </w:r>
+          </w:p>
+        </w:tc>
+      </w:tr>
+      <w:tr>
+        <w:trPr>
+          <w:cantSplit/>
+        </w:trPr>
+        <w:tc>
+          <w:tcPr>
+            <w:tcW w:type="dxa" w:w="1700"/>
+            <w:shd w:fill="EFF3F9" w:color="auto" w:val="clear"/>
+            <w:tcMar>
+              <w:top w:type="dxa" w:w="72"/>
+              <w:left w:type="dxa" w:w="95"/>
+              <w:bottom w:type="dxa" w:w="72"/>
+              <w:right w:type="dxa" w:w="95"/>
+            </w:tcMar>
+          </w:tcPr>
+          <w:p>
+            <w:pPr>
+              <w:spacing w:after="0" w:line="248"/>
+              <w:jc w:val="left"/>
+            </w:pPr>
+            <w:r>
+              <w:rPr>
+                <w:b/>
+                <w:bCs/>
+                <w:sz w:val="16"/>
+                <w:szCs w:val="16"/>
+              </w:rPr>
+              <w:t xml:space="preserve">ATCNet</w:t>
+            </w:r>
+          </w:p>
+        </w:tc>
+        <w:tc>
+          <w:tcPr>
+            <w:tcW w:type="dxa" w:w="1300"/>
+            <w:shd w:fill="EFF3F9" w:color="auto" w:val="clear"/>
+            <w:tcMar>
+              <w:top w:type="dxa" w:w="72"/>
+              <w:left w:type="dxa" w:w="95"/>
+              <w:bottom w:type="dxa" w:w="72"/>
+              <w:right w:type="dxa" w:w="95"/>
+            </w:tcMar>
+          </w:tcPr>
+          <w:p>
+            <w:pPr>
+              <w:spacing w:after="0" w:line="248"/>
+              <w:jc w:val="center"/>
+            </w:pPr>
+            <w:r>
+              <w:rPr>
+                <w:b w:val="false"/>
+                <w:bCs w:val="false"/>
+                <w:sz w:val="16"/>
+                <w:szCs w:val="16"/>
+              </w:rPr>
+              <w:t xml:space="preserve">81.10%</w:t>
+            </w:r>
+          </w:p>
+        </w:tc>
+        <w:tc>
+          <w:tcPr>
+            <w:tcW w:type="dxa" w:w="2700"/>
+            <w:shd w:fill="EFF3F9" w:color="auto" w:val="clear"/>
+            <w:tcMar>
+              <w:top w:type="dxa" w:w="72"/>
+              <w:left w:type="dxa" w:w="95"/>
+              <w:bottom w:type="dxa" w:w="72"/>
+              <w:right w:type="dxa" w:w="95"/>
+            </w:tcMar>
+          </w:tcPr>
+          <w:p>
+            <w:pPr>
+              <w:spacing w:after="0" w:line="248"/>
+              <w:jc w:val="left"/>
+            </w:pPr>
+            <w:r>
+              <w:rPr>
+                <w:b w:val="false"/>
+                <w:bCs w:val="false"/>
+                <w:sz w:val="16"/>
+                <w:szCs w:val="16"/>
+              </w:rPr>
+              <w:t xml:space="preserve">ATCNet authors' code repository</w:t>
+            </w:r>
+          </w:p>
+        </w:tc>
+        <w:tc>
+          <w:tcPr>
+            <w:tcW w:type="dxa" w:w="3800"/>
+            <w:shd w:fill="EFF3F9" w:color="auto" w:val="clear"/>
+            <w:tcMar>
+              <w:top w:type="dxa" w:w="72"/>
+              <w:left w:type="dxa" w:w="95"/>
+              <w:bottom w:type="dxa" w:w="72"/>
+              <w:right w:type="dxa" w:w="95"/>
+            </w:tcMar>
+          </w:tcPr>
+          <w:p>
+            <w:pPr>
+              <w:spacing w:after="0" w:line="248"/>
+              <w:jc w:val="left"/>
+            </w:pPr>
+            <w:r>
+              <w:rPr>
+                <w:b w:val="false"/>
+                <w:bCs w:val="false"/>
+                <w:sz w:val="16"/>
+                <w:szCs w:val="16"/>
+              </w:rPr>
+              <w:t xml:space="preserve">Train–validation–test script: session 1 trains, session 2 tests</w:t>
+            </w:r>
+          </w:p>
+        </w:tc>
+      </w:tr>
+      <w:tr>
+        <w:trPr>
+          <w:cantSplit/>
+        </w:trPr>
+        <w:tc>
+          <w:tcPr>
+            <w:tcW w:type="dxa" w:w="1700"/>
+            <w:tcMar>
+              <w:top w:type="dxa" w:w="72"/>
+              <w:left w:type="dxa" w:w="95"/>
+              <w:bottom w:type="dxa" w:w="72"/>
+              <w:right w:type="dxa" w:w="95"/>
+            </w:tcMar>
+          </w:tcPr>
+          <w:p>
+            <w:pPr>
+              <w:spacing w:after="0" w:line="248"/>
+              <w:jc w:val="left"/>
+            </w:pPr>
+            <w:r>
+              <w:rPr>
+                <w:b/>
+                <w:bCs/>
+                <w:sz w:val="16"/>
+                <w:szCs w:val="16"/>
+              </w:rPr>
+              <w:t xml:space="preserve">EEGNet</w:t>
+            </w:r>
+          </w:p>
+        </w:tc>
+        <w:tc>
+          <w:tcPr>
+            <w:tcW w:type="dxa" w:w="1300"/>
+            <w:tcMar>
+              <w:top w:type="dxa" w:w="72"/>
+              <w:left w:type="dxa" w:w="95"/>
+              <w:bottom w:type="dxa" w:w="72"/>
+              <w:right w:type="dxa" w:w="95"/>
+            </w:tcMar>
+          </w:tcPr>
+          <w:p>
+            <w:pPr>
+              <w:spacing w:after="0" w:line="248"/>
+              <w:jc w:val="center"/>
+            </w:pPr>
+            <w:r>
+              <w:rPr>
+                <w:b w:val="false"/>
+                <w:bCs w:val="false"/>
+                <w:sz w:val="16"/>
+                <w:szCs w:val="16"/>
+              </w:rPr>
+              <w:t xml:space="preserve">68.67%</w:t>
+            </w:r>
+          </w:p>
+        </w:tc>
+        <w:tc>
+          <w:tcPr>
+            <w:tcW w:type="dxa" w:w="2700"/>
+            <w:tcMar>
+              <w:top w:type="dxa" w:w="72"/>
+              <w:left w:type="dxa" w:w="95"/>
+              <w:bottom w:type="dxa" w:w="72"/>
+              <w:right w:type="dxa" w:w="95"/>
+            </w:tcMar>
+          </w:tcPr>
+          <w:p>
+            <w:pPr>
+              <w:spacing w:after="0" w:line="248"/>
+              <w:jc w:val="left"/>
+            </w:pPr>
+            <w:r>
+              <w:rPr>
+                <w:b w:val="false"/>
+                <w:bCs w:val="false"/>
+                <w:sz w:val="16"/>
+                <w:szCs w:val="16"/>
+              </w:rPr>
+              <w:t xml:space="preserve">ATCNet authors' code repository</w:t>
+            </w:r>
+          </w:p>
+        </w:tc>
+        <w:tc>
+          <w:tcPr>
+            <w:tcW w:type="dxa" w:w="3800"/>
+            <w:tcMar>
+              <w:top w:type="dxa" w:w="72"/>
+              <w:left w:type="dxa" w:w="95"/>
+              <w:bottom w:type="dxa" w:w="72"/>
+              <w:right w:type="dxa" w:w="95"/>
+            </w:tcMar>
+          </w:tcPr>
+          <w:p>
+            <w:pPr>
+              <w:spacing w:after="0" w:line="248"/>
+              <w:jc w:val="left"/>
+            </w:pPr>
+            <w:r>
+              <w:rPr>
+                <w:b w:val="false"/>
+                <w:bCs w:val="false"/>
+                <w:sz w:val="16"/>
+                <w:szCs w:val="16"/>
+              </w:rPr>
+              <w:t xml:space="preserve">The same train–validation–test script as the 81.10% ATCNet figure</w:t>
+            </w:r>
+          </w:p>
+        </w:tc>
+      </w:tr>
+      <w:tr>
+        <w:trPr>
+          <w:cantSplit/>
+        </w:trPr>
+        <w:tc>
+          <w:tcPr>
+            <w:tcW w:type="dxa" w:w="1700"/>
+            <w:shd w:fill="EFF3F9" w:color="auto" w:val="clear"/>
+            <w:tcMar>
+              <w:top w:type="dxa" w:w="72"/>
+              <w:left w:type="dxa" w:w="95"/>
+              <w:bottom w:type="dxa" w:w="72"/>
+              <w:right w:type="dxa" w:w="95"/>
+            </w:tcMar>
+          </w:tcPr>
+          <w:p>
+            <w:pPr>
+              <w:spacing w:after="0" w:line="248"/>
+              <w:jc w:val="left"/>
+            </w:pPr>
+            <w:r>
+              <w:rPr>
+                <w:b/>
+                <w:bCs/>
+                <w:sz w:val="16"/>
+                <w:szCs w:val="16"/>
+              </w:rPr>
+              <w:t xml:space="preserve">EEGNet+</w:t>
+            </w:r>
+          </w:p>
+        </w:tc>
+        <w:tc>
+          <w:tcPr>
+            <w:tcW w:type="dxa" w:w="1300"/>
+            <w:shd w:fill="EFF3F9" w:color="auto" w:val="clear"/>
+            <w:tcMar>
+              <w:top w:type="dxa" w:w="72"/>
+              <w:left w:type="dxa" w:w="95"/>
+              <w:bottom w:type="dxa" w:w="72"/>
+              <w:right w:type="dxa" w:w="95"/>
+            </w:tcMar>
+          </w:tcPr>
+          <w:p>
+            <w:pPr>
+              <w:spacing w:after="0" w:line="248"/>
+              <w:jc w:val="center"/>
+            </w:pPr>
+            <w:r>
+              <w:rPr>
+                <w:b w:val="false"/>
+                <w:bCs w:val="false"/>
+                <w:sz w:val="16"/>
+                <w:szCs w:val="16"/>
+              </w:rPr>
+              <w:t xml:space="preserve">77.39%</w:t>
+            </w:r>
+          </w:p>
+        </w:tc>
+        <w:tc>
+          <w:tcPr>
+            <w:tcW w:type="dxa" w:w="2700"/>
+            <w:shd w:fill="EFF3F9" w:color="auto" w:val="clear"/>
+            <w:tcMar>
+              <w:top w:type="dxa" w:w="72"/>
+              <w:left w:type="dxa" w:w="95"/>
+              <w:bottom w:type="dxa" w:w="72"/>
+              <w:right w:type="dxa" w:w="95"/>
+            </w:tcMar>
+          </w:tcPr>
+          <w:p>
+            <w:pPr>
+              <w:spacing w:after="0" w:line="248"/>
+              <w:jc w:val="left"/>
+            </w:pPr>
+            <w:r>
+              <w:rPr>
+                <w:b w:val="false"/>
+                <w:bCs w:val="false"/>
+                <w:sz w:val="16"/>
+                <w:szCs w:val="16"/>
+              </w:rPr>
+              <w:t xml:space="preserve">Zhao et al. (2024), re-implemented</w:t>
+            </w:r>
+          </w:p>
+        </w:tc>
+        <w:tc>
+          <w:tcPr>
+            <w:tcW w:type="dxa" w:w="3800"/>
+            <w:shd w:fill="EFF3F9" w:color="auto" w:val="clear"/>
+            <w:tcMar>
+              <w:top w:type="dxa" w:w="72"/>
+              <w:left w:type="dxa" w:w="95"/>
+              <w:bottom w:type="dxa" w:w="72"/>
+              <w:right w:type="dxa" w:w="95"/>
+            </w:tcMar>
+          </w:tcPr>
+          <w:p>
+            <w:pPr>
+              <w:spacing w:after="0" w:line="248"/>
+              <w:jc w:val="left"/>
+            </w:pPr>
+            <w:r>
+              <w:rPr>
+                <w:b w:val="false"/>
+                <w:bCs w:val="false"/>
+                <w:sz w:val="16"/>
+                <w:szCs w:val="16"/>
+              </w:rPr>
+              <w:t xml:space="preserve">The CTNet paper's subject-specific protocol, as for CTNet above</w:t>
+            </w:r>
+          </w:p>
+        </w:tc>
+      </w:tr>
+      <w:tr>
+        <w:trPr>
+          <w:cantSplit/>
+        </w:trPr>
+        <w:tc>
+          <w:tcPr>
+            <w:tcW w:type="dxa" w:w="1700"/>
+            <w:tcMar>
+              <w:top w:type="dxa" w:w="72"/>
+              <w:left w:type="dxa" w:w="95"/>
+              <w:bottom w:type="dxa" w:w="72"/>
+              <w:right w:type="dxa" w:w="95"/>
+            </w:tcMar>
+          </w:tcPr>
+          <w:p>
+            <w:pPr>
+              <w:spacing w:after="0" w:line="248"/>
+              <w:jc w:val="left"/>
+            </w:pPr>
+            <w:r>
+              <w:rPr>
+                <w:b/>
+                <w:bCs/>
+                <w:sz w:val="16"/>
+                <w:szCs w:val="16"/>
+              </w:rPr>
+              <w:t xml:space="preserve">EEG Conformer+</w:t>
+            </w:r>
+          </w:p>
+        </w:tc>
+        <w:tc>
+          <w:tcPr>
+            <w:tcW w:type="dxa" w:w="1300"/>
+            <w:tcMar>
+              <w:top w:type="dxa" w:w="72"/>
+              <w:left w:type="dxa" w:w="95"/>
+              <w:bottom w:type="dxa" w:w="72"/>
+              <w:right w:type="dxa" w:w="95"/>
+            </w:tcMar>
+          </w:tcPr>
+          <w:p>
+            <w:pPr>
+              <w:spacing w:after="0" w:line="248"/>
+              <w:jc w:val="center"/>
+            </w:pPr>
+            <w:r>
+              <w:rPr>
+                <w:b w:val="false"/>
+                <w:bCs w:val="false"/>
+                <w:sz w:val="16"/>
+                <w:szCs w:val="16"/>
+              </w:rPr>
+              <w:t xml:space="preserve">77.66%</w:t>
+            </w:r>
+          </w:p>
+        </w:tc>
+        <w:tc>
+          <w:tcPr>
+            <w:tcW w:type="dxa" w:w="2700"/>
+            <w:tcMar>
+              <w:top w:type="dxa" w:w="72"/>
+              <w:left w:type="dxa" w:w="95"/>
+              <w:bottom w:type="dxa" w:w="72"/>
+              <w:right w:type="dxa" w:w="95"/>
+            </w:tcMar>
+          </w:tcPr>
+          <w:p>
+            <w:pPr>
+              <w:spacing w:after="0" w:line="248"/>
+              <w:jc w:val="left"/>
+            </w:pPr>
+            <w:r>
+              <w:rPr>
+                <w:b w:val="false"/>
+                <w:bCs w:val="false"/>
+                <w:sz w:val="16"/>
+                <w:szCs w:val="16"/>
+              </w:rPr>
+              <w:t xml:space="preserve">Zhao et al. (2024), re-implemented</w:t>
+            </w:r>
+          </w:p>
+        </w:tc>
+        <w:tc>
+          <w:tcPr>
+            <w:tcW w:type="dxa" w:w="3800"/>
+            <w:tcMar>
+              <w:top w:type="dxa" w:w="72"/>
+              <w:left w:type="dxa" w:w="95"/>
+              <w:bottom w:type="dxa" w:w="72"/>
+              <w:right w:type="dxa" w:w="95"/>
+            </w:tcMar>
+          </w:tcPr>
+          <w:p>
+            <w:pPr>
+              <w:spacing w:after="0" w:line="248"/>
+              <w:jc w:val="left"/>
+            </w:pPr>
+            <w:r>
+              <w:rPr>
+                <w:b w:val="false"/>
+                <w:bCs w:val="false"/>
+                <w:sz w:val="16"/>
+                <w:szCs w:val="16"/>
+              </w:rPr>
+              <w:t xml:space="preserve">The CTNet paper's subject-specific protocol, as for CTNet above</w:t>
+            </w:r>
+          </w:p>
+        </w:tc>
+      </w:tr>
+      <w:tr>
+        <w:trPr>
+          <w:cantSplit/>
+        </w:trPr>
+        <w:tc>
+          <w:tcPr>
+            <w:tcW w:type="dxa" w:w="1700"/>
+            <w:shd w:fill="EFF3F9" w:color="auto" w:val="clear"/>
+            <w:tcMar>
+              <w:top w:type="dxa" w:w="72"/>
+              <w:left w:type="dxa" w:w="95"/>
+              <w:bottom w:type="dxa" w:w="72"/>
+              <w:right w:type="dxa" w:w="95"/>
+            </w:tcMar>
+          </w:tcPr>
+          <w:p>
+            <w:pPr>
+              <w:spacing w:after="0" w:line="248"/>
+              <w:jc w:val="left"/>
+            </w:pPr>
+            <w:r>
+              <w:rPr>
+                <w:b/>
+                <w:bCs/>
+                <w:sz w:val="16"/>
+                <w:szCs w:val="16"/>
+              </w:rPr>
+              <w:t xml:space="preserve">FBCSP with LDA</w:t>
+            </w:r>
+          </w:p>
+        </w:tc>
+        <w:tc>
+          <w:tcPr>
+            <w:tcW w:type="dxa" w:w="1300"/>
+            <w:shd w:fill="EFF3F9" w:color="auto" w:val="clear"/>
+            <w:tcMar>
+              <w:top w:type="dxa" w:w="72"/>
+              <w:left w:type="dxa" w:w="95"/>
+              <w:bottom w:type="dxa" w:w="72"/>
+              <w:right w:type="dxa" w:w="95"/>
+            </w:tcMar>
+          </w:tcPr>
+          <w:p>
+            <w:pPr>
+              <w:spacing w:after="0" w:line="248"/>
+              <w:jc w:val="center"/>
+            </w:pPr>
+            <w:r>
+              <w:rPr>
+                <w:b w:val="false"/>
+                <w:bCs w:val="false"/>
+                <w:sz w:val="16"/>
+                <w:szCs w:val="16"/>
+              </w:rPr>
+              <w:t xml:space="preserve">Approximately 68%</w:t>
+            </w:r>
+          </w:p>
+        </w:tc>
+        <w:tc>
+          <w:tcPr>
+            <w:tcW w:type="dxa" w:w="2700"/>
+            <w:shd w:fill="EFF3F9" w:color="auto" w:val="clear"/>
+            <w:tcMar>
+              <w:top w:type="dxa" w:w="72"/>
+              <w:left w:type="dxa" w:w="95"/>
+              <w:bottom w:type="dxa" w:w="72"/>
+              <w:right w:type="dxa" w:w="95"/>
+            </w:tcMar>
+          </w:tcPr>
+          <w:p>
+            <w:pPr>
+              <w:spacing w:after="0" w:line="248"/>
+              <w:jc w:val="left"/>
+            </w:pPr>
+            <w:r>
+              <w:rPr>
+                <w:b w:val="false"/>
+                <w:bCs w:val="false"/>
+                <w:sz w:val="16"/>
+                <w:szCs w:val="16"/>
+              </w:rPr>
+              <w:t xml:space="preserve">BCI Competition IV results (Ang et al.)</w:t>
+            </w:r>
+          </w:p>
+        </w:tc>
+        <w:tc>
+          <w:tcPr>
+            <w:tcW w:type="dxa" w:w="3800"/>
+            <w:shd w:fill="EFF3F9" w:color="auto" w:val="clear"/>
+            <w:tcMar>
+              <w:top w:type="dxa" w:w="72"/>
+              <w:left w:type="dxa" w:w="95"/>
+              <w:bottom w:type="dxa" w:w="72"/>
+              <w:right w:type="dxa" w:w="95"/>
+            </w:tcMar>
+          </w:tcPr>
+          <w:p>
+            <w:pPr>
+              <w:spacing w:after="0" w:line="248"/>
+              <w:jc w:val="left"/>
+            </w:pPr>
+            <w:r>
+              <w:rPr>
+                <w:b w:val="false"/>
+                <w:bCs w:val="false"/>
+                <w:sz w:val="16"/>
+                <w:szCs w:val="16"/>
+              </w:rPr>
+              <w:t xml:space="preserve">Competition protocol, session 1 trains, session 2 tests; not re-checked in the 2026 audit</w:t>
+            </w:r>
+          </w:p>
+        </w:tc>
+      </w:tr>
+    </w:tbl>
+    <w:p>
+      <w:pPr>
+        <w:spacing w:after="190" w:before="70"/>
+      </w:pPr>
+      <w:r>
+        <w:rPr>
+          <w:i/>
+          <w:iCs/>
+          <w:color w:val="5A6478"/>
+          <w:sz w:val="17"/>
+          <w:szCs w:val="17"/>
+        </w:rPr>
+        <w:t xml:space="preserve">Table 15.3 — Published within-subject accuracies on BCI IV-2a, with the source and the evaluation behind each. These figures come from different protocols and are comparable neither with each other nor with the cross-subject results in Table 15.2. An EEGNet figure of 71.50% that appeared in an earlier version of this table has been removed because no source for it could be verified.</w:t>
       </w:r>
     </w:p>
     <w:p>
@@ -22418,7 +25886,7 @@
           <w:sz w:val="17"/>
           <w:szCs w:val="17"/>
         </w:rPr>
-        <w:t xml:space="preserve">Table 15.2 — Strengths, limitations, and the purpose each baseline serves in this project.</w:t>
+        <w:t xml:space="preserve">Table 15.4 — Strengths, limitations, and the purpose each baseline serves in this project.</w:t>
       </w:r>
     </w:p>
     <w:p>
@@ -22488,7 +25956,20 @@
                 <w:sz w:val="20"/>
                 <w:szCs w:val="20"/>
               </w:rPr>
-              <w:t xml:space="preserve">The accuracies in Table 15.1 were obtained under different evaluation protocols. Some use a hold-out split, some use cross-validation, and some are subject-specific. EEGNet is quoted at 68.67 per cent by one paper and 71.50 per cent by another for the same model on the same dataset, purely because the evaluation differs.</w:t>
+              <w:t xml:space="preserve">The within-subject accuracies in Table 15.3 were obtained under different evaluation protocols and cannot be ranked against one another. The same model on the same dataset differs by several points depending on who evaluated it: EEGNet is 68.67 per cent in the ATCNet repository's evaluation and 77.39 per cent in the CTNet paper's re-implementation.</w:t>
+            </w:r>
+          </w:p>
+          <w:p>
+            <w:pPr>
+              <w:spacing w:after="50" w:line="288"/>
+              <w:jc w:val="both"/>
+            </w:pPr>
+            <w:r>
+              <w:rPr>
+                <w:sz w:val="20"/>
+                <w:szCs w:val="20"/>
+              </w:rPr>
+              <w:t xml:space="preserve">Cross-subject figures are scarcer. Table 15.2 is the only published comparison of these architectures under one leave-one-subject-out protocol that could be verified, and it serves as the reference for this project's cross-subject results. This project's own protocol differs from it in stated ways — seven training subjects plus a separate validation subject, early stopping, a 3.5 s window and Euclidean alignment — so the comparison is indicative rather than exact.</w:t>
             </w:r>
           </w:p>
           <w:p>
@@ -28773,7 +32254,7 @@
                 <w:sz w:val="16"/>
                 <w:szCs w:val="16"/>
               </w:rPr>
-              <w:t xml:space="preserve">2,548</w:t>
+              <w:t xml:space="preserve">3,188</w:t>
             </w:r>
           </w:p>
         </w:tc>
@@ -29207,7 +32688,7 @@
                 <w:sz w:val="16"/>
                 <w:szCs w:val="16"/>
               </w:rPr>
-              <w:t xml:space="preserve">—</w:t>
+              <w:t xml:space="preserve">697,412</w:t>
             </w:r>
           </w:p>
         </w:tc>
@@ -29427,7 +32908,7 @@
                 <w:sz w:val="16"/>
                 <w:szCs w:val="16"/>
               </w:rPr>
-              <w:t xml:space="preserve">—</w:t>
+              <w:t xml:space="preserve">152,364</w:t>
             </w:r>
           </w:p>
         </w:tc>
@@ -29693,7 +33174,7 @@
           <w:sz w:val="17"/>
           <w:szCs w:val="17"/>
         </w:rPr>
-        <w:t xml:space="preserve">Template 17.2 — Summary of metrics and cost. The parameter column is already known and is filled in; everything else is measured.</w:t>
+        <w:t xml:space="preserve">Template 17.2 — Summary of metrics and cost. The parameter column is already known (braindecode 1.8.1 reference implementations at this project's 875-sample input) and is filled in; everything else is measured.</w:t>
       </w:r>
     </w:p>
     <w:p>

</xml_diff>